<commit_message>
added tZTM & Fix MOR
</commit_message>
<xml_diff>
--- a/template/ddp_template.docx
+++ b/template/ddp_template.docx
@@ -1204,24 +1204,23 @@
               <w:widowControl w:val="false"/>
               <w:spacing w:before="120" w:after="120"/>
               <w:ind w:left="57" w:right="57" w:hanging="0"/>
-              <w:jc w:val="center"/>
-              <w:rPr>
-                <w:b/>
-                <w:b/>
+              <w:jc w:val="right"/>
+              <w:rPr>
                 <w:bCs/>
-                <w:sz w:val="16"/>
-                <w:szCs w:val="16"/>
-              </w:rPr>
-            </w:pPr>
+              </w:rPr>
+            </w:pPr>
+            <w:bookmarkStart w:id="3" w:name="_Hlk17264115111"/>
             <w:r>
               <w:rPr>
                 <w:b/>
                 <w:bCs/>
                 <w:sz w:val="16"/>
                 <w:szCs w:val="16"/>
-              </w:rPr>
-              <w:t>July 18, 2025</w:t>
-            </w:r>
+                <w:lang w:eastAsia="en-CA"/>
+              </w:rPr>
+              <w:t>${ddpRevisionDate}</w:t>
+            </w:r>
+            <w:bookmarkEnd w:id="3"/>
           </w:p>
         </w:tc>
         <w:tc>
@@ -1357,24 +1356,23 @@
               <w:widowControl w:val="false"/>
               <w:spacing w:before="120" w:after="120"/>
               <w:ind w:left="57" w:right="57" w:hanging="0"/>
-              <w:jc w:val="center"/>
-              <w:rPr>
-                <w:b/>
-                <w:b/>
+              <w:jc w:val="right"/>
+              <w:rPr>
                 <w:bCs/>
-                <w:sz w:val="16"/>
-                <w:szCs w:val="16"/>
-              </w:rPr>
-            </w:pPr>
+              </w:rPr>
+            </w:pPr>
+            <w:bookmarkStart w:id="4" w:name="_Hlk17264115112"/>
             <w:r>
               <w:rPr>
                 <w:b/>
                 <w:bCs/>
                 <w:sz w:val="16"/>
                 <w:szCs w:val="16"/>
-              </w:rPr>
-              <w:t>July 18, 2025</w:t>
-            </w:r>
+                <w:lang w:eastAsia="en-CA"/>
+              </w:rPr>
+              <w:t>${ddpRevisionDate}</w:t>
+            </w:r>
+            <w:bookmarkEnd w:id="4"/>
           </w:p>
         </w:tc>
         <w:tc>
@@ -1410,7 +1408,7 @@
                 <w:sz w:val="16"/>
                 <w:szCs w:val="16"/>
               </w:rPr>
-              <w:t>1.0</w:t>
+              <w:t>${ddpVersion}</w:t>
             </w:r>
           </w:p>
         </w:tc>
@@ -1430,24 +1428,20 @@
               <w:pStyle w:val="Normal"/>
               <w:widowControl w:val="false"/>
               <w:spacing w:before="120" w:after="120"/>
-              <w:ind w:left="57" w:right="57" w:hanging="0"/>
-              <w:jc w:val="center"/>
-              <w:rPr>
-                <w:b/>
+              <w:ind w:right="-7" w:hanging="0"/>
+              <w:jc w:val="right"/>
+              <w:rPr>
+                <w:szCs w:val="20"/>
+              </w:rPr>
+            </w:pPr>
+            <w:r>
+              <w:rPr>
                 <w:b/>
                 <w:bCs/>
                 <w:sz w:val="16"/>
-                <w:szCs w:val="16"/>
-              </w:rPr>
-            </w:pPr>
-            <w:r>
-              <w:rPr>
-                <w:b/>
-                <w:bCs/>
-                <w:sz w:val="16"/>
-                <w:szCs w:val="16"/>
-              </w:rPr>
-              <w:t>Brandon StCoeur</w:t>
+                <w:szCs w:val="20"/>
+              </w:rPr>
+              <w:t>${ddpSpecialist}</w:t>
             </w:r>
           </w:p>
         </w:tc>
@@ -2390,10 +2384,10 @@
             <w:fldChar w:fldCharType="separate"/>
           </w:r>
           <w:hyperlink w:anchor="_Toc203748219">
-            <w:bookmarkStart w:id="3" w:name="_Ref390146146"/>
-            <w:bookmarkStart w:id="4" w:name="_Toc415882796"/>
-            <w:bookmarkEnd w:id="3"/>
-            <w:bookmarkEnd w:id="4"/>
+            <w:bookmarkStart w:id="5" w:name="_Toc415882796"/>
+            <w:bookmarkStart w:id="6" w:name="_Ref390146146"/>
+            <w:bookmarkEnd w:id="5"/>
+            <w:bookmarkEnd w:id="6"/>
             <w:r>
               <w:rPr>
                 <w:webHidden/>
@@ -3823,12 +3817,12 @@
           <w14:ligatures w14:val="none"/>
         </w:rPr>
       </w:r>
-      <w:bookmarkStart w:id="5" w:name="_Ref3901461461"/>
-      <w:bookmarkStart w:id="6" w:name="_Toc4158827961"/>
-      <w:bookmarkStart w:id="7" w:name="_Ref3901461461"/>
-      <w:bookmarkStart w:id="8" w:name="_Toc4158827961"/>
-      <w:bookmarkEnd w:id="7"/>
-      <w:bookmarkEnd w:id="8"/>
+      <w:bookmarkStart w:id="7" w:name="_Toc4158827961"/>
+      <w:bookmarkStart w:id="8" w:name="_Ref3901461461"/>
+      <w:bookmarkStart w:id="9" w:name="_Toc4158827961"/>
+      <w:bookmarkStart w:id="10" w:name="_Ref3901461461"/>
+      <w:bookmarkEnd w:id="9"/>
+      <w:bookmarkEnd w:id="10"/>
     </w:p>
     <w:p>
       <w:pPr>
@@ -3850,23 +3844,21 @@
         <w:ind w:left="431" w:hanging="431"/>
         <w:rPr/>
       </w:pPr>
-      <w:bookmarkStart w:id="9" w:name="_Toc203748219"/>
-      <w:bookmarkStart w:id="10" w:name="_Toc415882797"/>
-      <w:bookmarkStart w:id="11" w:name="_Toc438028050"/>
-      <w:bookmarkStart w:id="12" w:name="_Toc445549124"/>
-      <w:bookmarkStart w:id="13" w:name="_Toc445549286"/>
-      <w:bookmarkStart w:id="14" w:name="_Toc447963587"/>
-      <w:bookmarkStart w:id="15" w:name="_Toc447963653"/>
-      <w:bookmarkStart w:id="16" w:name="_Toc452786394"/>
-      <w:bookmarkStart w:id="17" w:name="_Toc462720233"/>
-      <w:bookmarkStart w:id="18" w:name="_Toc274299543"/>
-      <w:bookmarkStart w:id="19" w:name="_Toc278895670"/>
+      <w:bookmarkStart w:id="11" w:name="_Toc452786394"/>
+      <w:bookmarkStart w:id="12" w:name="_Toc203748219"/>
+      <w:bookmarkStart w:id="13" w:name="_Toc415882797"/>
+      <w:bookmarkStart w:id="14" w:name="_Toc438028050"/>
+      <w:bookmarkStart w:id="15" w:name="_Toc445549124"/>
+      <w:bookmarkStart w:id="16" w:name="_Toc445549286"/>
+      <w:bookmarkStart w:id="17" w:name="_Toc447963587"/>
+      <w:bookmarkStart w:id="18" w:name="_Toc447963653"/>
+      <w:bookmarkStart w:id="19" w:name="_Toc462720233"/>
+      <w:bookmarkStart w:id="20" w:name="_Toc274299543"/>
+      <w:bookmarkStart w:id="21" w:name="_Toc278895670"/>
       <w:r>
         <w:rPr/>
         <w:t>INTRODUCTION</w:t>
       </w:r>
-      <w:bookmarkEnd w:id="9"/>
-      <w:bookmarkEnd w:id="10"/>
       <w:bookmarkEnd w:id="11"/>
       <w:bookmarkEnd w:id="12"/>
       <w:bookmarkEnd w:id="13"/>
@@ -3876,6 +3868,8 @@
       <w:bookmarkEnd w:id="17"/>
       <w:bookmarkEnd w:id="18"/>
       <w:bookmarkEnd w:id="19"/>
+      <w:bookmarkEnd w:id="20"/>
+      <w:bookmarkEnd w:id="21"/>
     </w:p>
     <w:p>
       <w:pPr>
@@ -3886,12 +3880,12 @@
         <w:jc w:val="both"/>
         <w:rPr/>
       </w:pPr>
-      <w:bookmarkStart w:id="20" w:name="_Hlk115275716"/>
+      <w:bookmarkStart w:id="22" w:name="_Hlk115275716"/>
       <w:r>
         <w:rPr/>
         <w:t xml:space="preserve">The purpose of the project </w:t>
       </w:r>
-      <w:bookmarkEnd w:id="20"/>
+      <w:bookmarkEnd w:id="22"/>
       <w:r>
         <w:rPr/>
         <w:t>is to support the 2025 dSDE BAU Capacity upgrade program by installing 1x MPC7E both DGW70.NFSJ and DGW71.NFSJ on slot # 5 of each router and Install 2 x 100G FR and 2 x e SR optics in each router to facilitate the utilization of newly added ports.</w:t>
@@ -3910,7 +3904,7 @@
           <w:bCs/>
         </w:rPr>
       </w:pPr>
-      <w:bookmarkStart w:id="21" w:name="_Hlk115275737"/>
+      <w:bookmarkStart w:id="23" w:name="_Hlk115275737"/>
       <w:r>
         <w:rPr/>
         <w:t xml:space="preserve">The purpose of the DDP is to install </w:t>
@@ -3957,7 +3951,7 @@
         </w:rPr>
         <w:t>541 Kenmount Rd, St. John's, NL (STJHNFAS/ NFSJ/ S0222).</w:t>
       </w:r>
-      <w:bookmarkEnd w:id="21"/>
+      <w:bookmarkEnd w:id="23"/>
     </w:p>
     <w:p>
       <w:pPr>
@@ -4498,12 +4492,12 @@
         <w:spacing w:lineRule="auto" w:line="360"/>
         <w:rPr/>
       </w:pPr>
-      <w:bookmarkStart w:id="22" w:name="_Toc203748220"/>
+      <w:bookmarkStart w:id="24" w:name="_Toc203748220"/>
       <w:r>
         <w:rPr/>
         <w:t>Contact Information</w:t>
       </w:r>
-      <w:bookmarkEnd w:id="22"/>
+      <w:bookmarkEnd w:id="24"/>
     </w:p>
     <w:tbl>
       <w:tblPr>
@@ -4520,8 +4514,8 @@
         <w:tblLook w:val="04a0" w:noHBand="0" w:noVBand="1" w:firstColumn="1" w:lastRow="0" w:lastColumn="0" w:firstRow="1"/>
       </w:tblPr>
       <w:tblGrid>
-        <w:gridCol w:w="1835"/>
-        <w:gridCol w:w="4191"/>
+        <w:gridCol w:w="1834"/>
+        <w:gridCol w:w="4192"/>
         <w:gridCol w:w="3085"/>
       </w:tblGrid>
       <w:tr>
@@ -4530,7 +4524,7 @@
         </w:trPr>
         <w:tc>
           <w:tcPr>
-            <w:tcW w:w="1835" w:type="dxa"/>
+            <w:tcW w:w="1834" w:type="dxa"/>
             <w:tcBorders>
               <w:top w:val="single" w:sz="4" w:space="0" w:color="000000"/>
               <w:left w:val="single" w:sz="4" w:space="0" w:color="000000"/>
@@ -4571,7 +4565,7 @@
         </w:tc>
         <w:tc>
           <w:tcPr>
-            <w:tcW w:w="4191" w:type="dxa"/>
+            <w:tcW w:w="4192" w:type="dxa"/>
             <w:tcBorders>
               <w:top w:val="single" w:sz="4" w:space="0" w:color="000000"/>
               <w:left w:val="single" w:sz="4" w:space="0" w:color="000000"/>
@@ -4658,7 +4652,7 @@
         </w:trPr>
         <w:tc>
           <w:tcPr>
-            <w:tcW w:w="1835" w:type="dxa"/>
+            <w:tcW w:w="1834" w:type="dxa"/>
             <w:tcBorders>
               <w:top w:val="single" w:sz="4" w:space="0" w:color="000000"/>
               <w:left w:val="single" w:sz="4" w:space="0" w:color="000000"/>
@@ -4692,7 +4686,7 @@
         </w:tc>
         <w:tc>
           <w:tcPr>
-            <w:tcW w:w="4191" w:type="dxa"/>
+            <w:tcW w:w="4192" w:type="dxa"/>
             <w:tcBorders>
               <w:top w:val="single" w:sz="4" w:space="0" w:color="000000"/>
               <w:left w:val="single" w:sz="4" w:space="0" w:color="000000"/>
@@ -4765,7 +4759,7 @@
         </w:trPr>
         <w:tc>
           <w:tcPr>
-            <w:tcW w:w="1835" w:type="dxa"/>
+            <w:tcW w:w="1834" w:type="dxa"/>
             <w:tcBorders>
               <w:top w:val="single" w:sz="4" w:space="0" w:color="000000"/>
               <w:left w:val="single" w:sz="4" w:space="0" w:color="000000"/>
@@ -4799,7 +4793,7 @@
         </w:tc>
         <w:tc>
           <w:tcPr>
-            <w:tcW w:w="4191" w:type="dxa"/>
+            <w:tcW w:w="4192" w:type="dxa"/>
             <w:tcBorders>
               <w:top w:val="single" w:sz="4" w:space="0" w:color="000000"/>
               <w:left w:val="single" w:sz="4" w:space="0" w:color="000000"/>
@@ -4872,7 +4866,7 @@
         </w:trPr>
         <w:tc>
           <w:tcPr>
-            <w:tcW w:w="1835" w:type="dxa"/>
+            <w:tcW w:w="1834" w:type="dxa"/>
             <w:tcBorders>
               <w:top w:val="single" w:sz="4" w:space="0" w:color="000000"/>
               <w:left w:val="single" w:sz="4" w:space="0" w:color="000000"/>
@@ -4906,7 +4900,7 @@
         </w:tc>
         <w:tc>
           <w:tcPr>
-            <w:tcW w:w="4191" w:type="dxa"/>
+            <w:tcW w:w="4192" w:type="dxa"/>
             <w:tcBorders>
               <w:top w:val="single" w:sz="4" w:space="0" w:color="000000"/>
               <w:left w:val="single" w:sz="4" w:space="0" w:color="000000"/>
@@ -4981,7 +4975,7 @@
         </w:trPr>
         <w:tc>
           <w:tcPr>
-            <w:tcW w:w="1835" w:type="dxa"/>
+            <w:tcW w:w="1834" w:type="dxa"/>
             <w:tcBorders>
               <w:top w:val="single" w:sz="4" w:space="0" w:color="000000"/>
               <w:left w:val="single" w:sz="4" w:space="0" w:color="000000"/>
@@ -5015,7 +5009,7 @@
         </w:tc>
         <w:tc>
           <w:tcPr>
-            <w:tcW w:w="4191" w:type="dxa"/>
+            <w:tcW w:w="4192" w:type="dxa"/>
             <w:tcBorders>
               <w:top w:val="single" w:sz="4" w:space="0" w:color="000000"/>
               <w:left w:val="single" w:sz="4" w:space="0" w:color="000000"/>
@@ -5090,7 +5084,7 @@
         </w:trPr>
         <w:tc>
           <w:tcPr>
-            <w:tcW w:w="1835" w:type="dxa"/>
+            <w:tcW w:w="1834" w:type="dxa"/>
             <w:tcBorders>
               <w:top w:val="single" w:sz="4" w:space="0" w:color="000000"/>
               <w:left w:val="single" w:sz="4" w:space="0" w:color="000000"/>
@@ -5124,7 +5118,7 @@
         </w:tc>
         <w:tc>
           <w:tcPr>
-            <w:tcW w:w="4191" w:type="dxa"/>
+            <w:tcW w:w="4192" w:type="dxa"/>
             <w:tcBorders>
               <w:top w:val="single" w:sz="4" w:space="0" w:color="000000"/>
               <w:left w:val="single" w:sz="4" w:space="0" w:color="000000"/>
@@ -5219,7 +5213,7 @@
         </w:trPr>
         <w:tc>
           <w:tcPr>
-            <w:tcW w:w="1835" w:type="dxa"/>
+            <w:tcW w:w="1834" w:type="dxa"/>
             <w:tcBorders>
               <w:top w:val="single" w:sz="4" w:space="0" w:color="000000"/>
               <w:left w:val="single" w:sz="4" w:space="0" w:color="000000"/>
@@ -5253,7 +5247,7 @@
         </w:tc>
         <w:tc>
           <w:tcPr>
-            <w:tcW w:w="4191" w:type="dxa"/>
+            <w:tcW w:w="4192" w:type="dxa"/>
             <w:tcBorders>
               <w:top w:val="single" w:sz="4" w:space="0" w:color="000000"/>
               <w:left w:val="single" w:sz="4" w:space="0" w:color="000000"/>
@@ -5363,7 +5357,7 @@
           <w:smallCaps w:val="false"/>
         </w:rPr>
       </w:pPr>
-      <w:bookmarkStart w:id="23" w:name="_Toc203748221"/>
+      <w:bookmarkStart w:id="25" w:name="_Toc203748221"/>
       <w:r>
         <w:rPr>
           <w:caps w:val="false"/>
@@ -5371,18 +5365,22 @@
         </w:rPr>
         <w:t>HIGH LEVEL DIAGRAM</w:t>
       </w:r>
-      <w:bookmarkEnd w:id="23"/>
+      <w:bookmarkEnd w:id="25"/>
     </w:p>
     <w:p>
       <w:pPr>
         <w:pStyle w:val="Normal"/>
         <w:spacing w:lineRule="auto" w:line="360"/>
         <w:ind w:left="431" w:hanging="0"/>
-        <w:rPr/>
-      </w:pPr>
-      <w:r>
-        <w:rPr/>
-        <w:t>N/A</w:t>
+        <w:rPr>
+          <w:lang w:val="en-US"/>
+        </w:rPr>
+      </w:pPr>
+      <w:r>
+        <w:rPr>
+          <w:lang w:val="en-US"/>
+        </w:rPr>
+        <w:t>${diagram_hl}</w:t>
       </w:r>
     </w:p>
     <w:p>
@@ -5392,14 +5390,14 @@
         <w:ind w:left="578" w:hanging="578"/>
         <w:rPr/>
       </w:pPr>
-      <w:bookmarkStart w:id="24" w:name="_Toc161407391"/>
-      <w:bookmarkStart w:id="25" w:name="_Toc203748222"/>
+      <w:bookmarkStart w:id="26" w:name="_Toc203748222"/>
+      <w:bookmarkStart w:id="27" w:name="_Toc161407391"/>
       <w:r>
         <w:rPr/>
         <w:t>Site Level Drawing</w:t>
       </w:r>
-      <w:bookmarkEnd w:id="24"/>
-      <w:bookmarkEnd w:id="25"/>
+      <w:bookmarkEnd w:id="26"/>
+      <w:bookmarkEnd w:id="27"/>
     </w:p>
     <w:p>
       <w:pPr>
@@ -5416,12 +5414,16 @@
         </w:sectPr>
         <w:pStyle w:val="Normal"/>
         <w:spacing w:lineRule="auto" w:line="360"/>
-        <w:ind w:left="720" w:hanging="0"/>
-        <w:rPr/>
-      </w:pPr>
-      <w:r>
-        <w:rPr/>
-        <w:t>N/A</w:t>
+        <w:ind w:left="431" w:hanging="0"/>
+        <w:rPr>
+          <w:lang w:val="en-US"/>
+        </w:rPr>
+      </w:pPr>
+      <w:r>
+        <w:rPr>
+          <w:lang w:val="en-US"/>
+        </w:rPr>
+        <w:t>${diagram_sl}</w:t>
       </w:r>
     </w:p>
     <w:p>
@@ -5435,7 +5437,7 @@
           <w:smallCaps w:val="false"/>
         </w:rPr>
       </w:pPr>
-      <w:bookmarkStart w:id="26" w:name="_Toc203748223"/>
+      <w:bookmarkStart w:id="28" w:name="_Toc203748223"/>
       <w:r>
         <w:rPr>
           <w:caps w:val="false"/>
@@ -5443,7 +5445,7 @@
         </w:rPr>
         <w:t>MATERIALS</w:t>
       </w:r>
-      <w:bookmarkEnd w:id="26"/>
+      <w:bookmarkEnd w:id="28"/>
     </w:p>
     <w:p>
       <w:pPr>
@@ -5559,9 +5561,9 @@
       </w:tblPr>
       <w:tblGrid>
         <w:gridCol w:w="1783"/>
-        <w:gridCol w:w="1338"/>
+        <w:gridCol w:w="1335"/>
         <w:gridCol w:w="2385"/>
-        <w:gridCol w:w="4332"/>
+        <w:gridCol w:w="4335"/>
         <w:gridCol w:w="744"/>
       </w:tblGrid>
       <w:tr>
@@ -5608,7 +5610,7 @@
         </w:tc>
         <w:tc>
           <w:tcPr>
-            <w:tcW w:w="1338" w:type="dxa"/>
+            <w:tcW w:w="1335" w:type="dxa"/>
             <w:tcBorders>
               <w:top w:val="single" w:sz="4" w:space="0" w:color="000000"/>
               <w:left w:val="single" w:sz="4" w:space="0" w:color="000000"/>
@@ -5684,7 +5686,7 @@
         </w:tc>
         <w:tc>
           <w:tcPr>
-            <w:tcW w:w="4332" w:type="dxa"/>
+            <w:tcW w:w="4335" w:type="dxa"/>
             <w:tcBorders>
               <w:top w:val="single" w:sz="4" w:space="0" w:color="000000"/>
               <w:left w:val="single" w:sz="4" w:space="0" w:color="000000"/>
@@ -5788,16 +5790,17 @@
             </w:pPr>
             <w:r>
               <w:rPr>
+                <w:color w:val="000000"/>
                 <w:sz w:val="22"/>
                 <w:szCs w:val="22"/>
               </w:rPr>
-              <w:t>4H7-107K-BG</w:t>
+              <w:t>${ceilRcpc}</w:t>
             </w:r>
           </w:p>
         </w:tc>
         <w:tc>
           <w:tcPr>
-            <w:tcW w:w="1338" w:type="dxa"/>
+            <w:tcW w:w="1335" w:type="dxa"/>
             <w:tcBorders>
               <w:top w:val="single" w:sz="4" w:space="0" w:color="000000"/>
               <w:left w:val="single" w:sz="4" w:space="0" w:color="000000"/>
@@ -5820,10 +5823,11 @@
             </w:pPr>
             <w:r>
               <w:rPr>
+                <w:color w:val="000000"/>
                 <w:sz w:val="22"/>
                 <w:szCs w:val="22"/>
               </w:rPr>
-              <w:t>Juniper</w:t>
+              <w:t>${ceilVendor}</w:t>
             </w:r>
           </w:p>
         </w:tc>
@@ -5852,16 +5856,17 @@
             </w:pPr>
             <w:r>
               <w:rPr>
+                <w:color w:val="000000"/>
                 <w:sz w:val="22"/>
                 <w:szCs w:val="22"/>
               </w:rPr>
-              <w:t>MPC7E-MRATE</w:t>
+              <w:t>${ceilPart}</w:t>
             </w:r>
           </w:p>
         </w:tc>
         <w:tc>
           <w:tcPr>
-            <w:tcW w:w="4332" w:type="dxa"/>
+            <w:tcW w:w="4335" w:type="dxa"/>
             <w:tcBorders>
               <w:top w:val="single" w:sz="4" w:space="0" w:color="000000"/>
               <w:left w:val="single" w:sz="4" w:space="0" w:color="000000"/>
@@ -5884,10 +5889,11 @@
             </w:pPr>
             <w:r>
               <w:rPr>
+                <w:color w:val="000000"/>
                 <w:sz w:val="22"/>
                 <w:szCs w:val="22"/>
               </w:rPr>
-              <w:t>10G/40G/100G QSFP28</w:t>
+              <w:t>${ceilDescription}</w:t>
             </w:r>
           </w:p>
         </w:tc>
@@ -5916,342 +5922,12 @@
             </w:pPr>
             <w:r>
               <w:rPr>
-                <w:sz w:val="22"/>
-                <w:szCs w:val="22"/>
-              </w:rPr>
-              <w:t>2</w:t>
-            </w:r>
-          </w:p>
-        </w:tc>
-      </w:tr>
-      <w:tr>
-        <w:trPr>
-          <w:trHeight w:val="438" w:hRule="atLeast"/>
-        </w:trPr>
-        <w:tc>
-          <w:tcPr>
-            <w:tcW w:w="1783" w:type="dxa"/>
-            <w:tcBorders>
-              <w:top w:val="single" w:sz="4" w:space="0" w:color="000000"/>
-              <w:left w:val="single" w:sz="4" w:space="0" w:color="000000"/>
-              <w:bottom w:val="single" w:sz="4" w:space="0" w:color="000000"/>
-              <w:right w:val="single" w:sz="4" w:space="0" w:color="000000"/>
-            </w:tcBorders>
-            <w:vAlign w:val="center"/>
-          </w:tcPr>
-          <w:p>
-            <w:pPr>
-              <w:pStyle w:val="Normal"/>
-              <w:widowControl w:val="false"/>
-              <w:spacing w:lineRule="auto" w:line="360"/>
-              <w:jc w:val="center"/>
-              <w:rPr>
                 <w:color w:val="000000"/>
                 <w:sz w:val="22"/>
                 <w:szCs w:val="22"/>
               </w:rPr>
-            </w:pPr>
-            <w:r>
-              <w:rPr>
-                <w:sz w:val="22"/>
-                <w:szCs w:val="22"/>
-              </w:rPr>
-              <w:t>4H7-107J-BG</w:t>
-            </w:r>
-          </w:p>
-        </w:tc>
-        <w:tc>
-          <w:tcPr>
-            <w:tcW w:w="1338" w:type="dxa"/>
-            <w:tcBorders>
-              <w:top w:val="single" w:sz="4" w:space="0" w:color="000000"/>
-              <w:left w:val="single" w:sz="4" w:space="0" w:color="000000"/>
-              <w:bottom w:val="single" w:sz="4" w:space="0" w:color="000000"/>
-              <w:right w:val="single" w:sz="4" w:space="0" w:color="000000"/>
-            </w:tcBorders>
-            <w:vAlign w:val="center"/>
-          </w:tcPr>
-          <w:p>
-            <w:pPr>
-              <w:pStyle w:val="Normal"/>
-              <w:widowControl w:val="false"/>
-              <w:spacing w:lineRule="auto" w:line="360"/>
-              <w:jc w:val="center"/>
-              <w:rPr>
-                <w:color w:val="000000"/>
-                <w:sz w:val="22"/>
-                <w:szCs w:val="22"/>
-              </w:rPr>
-            </w:pPr>
-            <w:r>
-              <w:rPr>
-                <w:sz w:val="22"/>
-                <w:szCs w:val="22"/>
-              </w:rPr>
-              <w:t>Juniper</w:t>
-            </w:r>
-          </w:p>
-        </w:tc>
-        <w:tc>
-          <w:tcPr>
-            <w:tcW w:w="2385" w:type="dxa"/>
-            <w:tcBorders>
-              <w:top w:val="single" w:sz="4" w:space="0" w:color="000000"/>
-              <w:left w:val="single" w:sz="4" w:space="0" w:color="000000"/>
-              <w:bottom w:val="single" w:sz="4" w:space="0" w:color="000000"/>
-              <w:right w:val="single" w:sz="4" w:space="0" w:color="000000"/>
-            </w:tcBorders>
-            <w:vAlign w:val="center"/>
-          </w:tcPr>
-          <w:p>
-            <w:pPr>
-              <w:pStyle w:val="Normal"/>
-              <w:widowControl w:val="false"/>
-              <w:spacing w:lineRule="auto" w:line="360"/>
-              <w:jc w:val="center"/>
-              <w:rPr>
-                <w:color w:val="000000"/>
-                <w:sz w:val="22"/>
-                <w:szCs w:val="22"/>
-              </w:rPr>
-            </w:pPr>
-            <w:r>
-              <w:rPr>
-                <w:sz w:val="22"/>
-                <w:szCs w:val="22"/>
-              </w:rPr>
-              <w:t>QSFP-100G-SR4-C</w:t>
-            </w:r>
-          </w:p>
-        </w:tc>
-        <w:tc>
-          <w:tcPr>
-            <w:tcW w:w="4332" w:type="dxa"/>
-            <w:tcBorders>
-              <w:top w:val="single" w:sz="4" w:space="0" w:color="000000"/>
-              <w:left w:val="single" w:sz="4" w:space="0" w:color="000000"/>
-              <w:bottom w:val="single" w:sz="4" w:space="0" w:color="000000"/>
-              <w:right w:val="single" w:sz="4" w:space="0" w:color="000000"/>
-            </w:tcBorders>
-            <w:vAlign w:val="center"/>
-          </w:tcPr>
-          <w:p>
-            <w:pPr>
-              <w:pStyle w:val="Normal"/>
-              <w:widowControl w:val="false"/>
-              <w:spacing w:lineRule="auto" w:line="360"/>
-              <w:jc w:val="center"/>
-              <w:rPr>
-                <w:color w:val="000000"/>
-                <w:sz w:val="22"/>
-                <w:szCs w:val="22"/>
-              </w:rPr>
-            </w:pPr>
-            <w:r>
-              <w:rPr>
-                <w:sz w:val="22"/>
-                <w:szCs w:val="22"/>
-              </w:rPr>
-              <w:t>QSFP-28, 100G-SR4 Transceiver</w:t>
-            </w:r>
-          </w:p>
-        </w:tc>
-        <w:tc>
-          <w:tcPr>
-            <w:tcW w:w="744" w:type="dxa"/>
-            <w:tcBorders>
-              <w:top w:val="single" w:sz="4" w:space="0" w:color="000000"/>
-              <w:left w:val="single" w:sz="4" w:space="0" w:color="000000"/>
-              <w:bottom w:val="single" w:sz="4" w:space="0" w:color="000000"/>
-              <w:right w:val="single" w:sz="4" w:space="0" w:color="000000"/>
-            </w:tcBorders>
-            <w:vAlign w:val="center"/>
-          </w:tcPr>
-          <w:p>
-            <w:pPr>
-              <w:pStyle w:val="Normal"/>
-              <w:widowControl w:val="false"/>
-              <w:spacing w:lineRule="auto" w:line="360"/>
-              <w:jc w:val="center"/>
-              <w:rPr>
-                <w:color w:val="000000"/>
-                <w:sz w:val="22"/>
-                <w:szCs w:val="22"/>
-              </w:rPr>
-            </w:pPr>
-            <w:r>
-              <w:rPr>
-                <w:sz w:val="22"/>
-                <w:szCs w:val="22"/>
-              </w:rPr>
-              <w:t>4</w:t>
-            </w:r>
-          </w:p>
-        </w:tc>
-      </w:tr>
-      <w:tr>
-        <w:trPr>
-          <w:trHeight w:val="610" w:hRule="atLeast"/>
-        </w:trPr>
-        <w:tc>
-          <w:tcPr>
-            <w:tcW w:w="1783" w:type="dxa"/>
-            <w:tcBorders>
-              <w:top w:val="single" w:sz="4" w:space="0" w:color="000000"/>
-              <w:left w:val="single" w:sz="4" w:space="0" w:color="000000"/>
-              <w:bottom w:val="single" w:sz="4" w:space="0" w:color="000000"/>
-              <w:right w:val="single" w:sz="4" w:space="0" w:color="000000"/>
-            </w:tcBorders>
-            <w:vAlign w:val="center"/>
-          </w:tcPr>
-          <w:p>
-            <w:pPr>
-              <w:pStyle w:val="Normal"/>
-              <w:widowControl w:val="false"/>
-              <w:spacing w:lineRule="auto" w:line="360"/>
-              <w:jc w:val="center"/>
-              <w:rPr>
-                <w:color w:val="000000"/>
-                <w:sz w:val="22"/>
-                <w:szCs w:val="22"/>
-              </w:rPr>
-            </w:pPr>
-            <w:r>
-              <w:rPr>
-                <w:sz w:val="22"/>
-                <w:szCs w:val="22"/>
-              </w:rPr>
-              <w:t>414-100K-BG</w:t>
-            </w:r>
-          </w:p>
-        </w:tc>
-        <w:tc>
-          <w:tcPr>
-            <w:tcW w:w="1338" w:type="dxa"/>
-            <w:tcBorders>
-              <w:top w:val="single" w:sz="4" w:space="0" w:color="000000"/>
-              <w:left w:val="single" w:sz="4" w:space="0" w:color="000000"/>
-              <w:bottom w:val="single" w:sz="4" w:space="0" w:color="000000"/>
-              <w:right w:val="single" w:sz="4" w:space="0" w:color="000000"/>
-            </w:tcBorders>
-            <w:vAlign w:val="center"/>
-          </w:tcPr>
-          <w:p>
-            <w:pPr>
-              <w:pStyle w:val="Normal"/>
-              <w:widowControl w:val="false"/>
-              <w:spacing w:lineRule="auto" w:line="360"/>
-              <w:jc w:val="center"/>
-              <w:rPr>
-                <w:color w:val="000000"/>
-                <w:sz w:val="22"/>
-                <w:szCs w:val="22"/>
-              </w:rPr>
-            </w:pPr>
-            <w:r>
-              <w:rPr>
-                <w:sz w:val="22"/>
-                <w:szCs w:val="22"/>
-              </w:rPr>
-              <w:t>Juniper</w:t>
-            </w:r>
-          </w:p>
-        </w:tc>
-        <w:tc>
-          <w:tcPr>
-            <w:tcW w:w="2385" w:type="dxa"/>
-            <w:tcBorders>
-              <w:top w:val="single" w:sz="4" w:space="0" w:color="000000"/>
-              <w:left w:val="single" w:sz="4" w:space="0" w:color="000000"/>
-              <w:bottom w:val="single" w:sz="4" w:space="0" w:color="000000"/>
-              <w:right w:val="single" w:sz="4" w:space="0" w:color="000000"/>
-            </w:tcBorders>
-            <w:vAlign w:val="center"/>
-          </w:tcPr>
-          <w:p>
-            <w:pPr>
-              <w:pStyle w:val="Normal"/>
-              <w:widowControl w:val="false"/>
-              <w:spacing w:lineRule="auto" w:line="360"/>
-              <w:jc w:val="center"/>
-              <w:rPr>
-                <w:color w:val="000000"/>
-                <w:sz w:val="22"/>
-                <w:szCs w:val="22"/>
-              </w:rPr>
-            </w:pPr>
-            <w:r>
-              <w:rPr>
-                <w:sz w:val="22"/>
-                <w:szCs w:val="22"/>
-              </w:rPr>
-              <w:t>QSFP-100G-FR</w:t>
-            </w:r>
-          </w:p>
-        </w:tc>
-        <w:tc>
-          <w:tcPr>
-            <w:tcW w:w="4332" w:type="dxa"/>
-            <w:tcBorders>
-              <w:top w:val="single" w:sz="4" w:space="0" w:color="000000"/>
-              <w:left w:val="single" w:sz="4" w:space="0" w:color="000000"/>
-              <w:bottom w:val="single" w:sz="4" w:space="0" w:color="000000"/>
-              <w:right w:val="single" w:sz="4" w:space="0" w:color="000000"/>
-            </w:tcBorders>
-            <w:vAlign w:val="center"/>
-          </w:tcPr>
-          <w:p>
-            <w:pPr>
-              <w:pStyle w:val="Normal"/>
-              <w:widowControl w:val="false"/>
-              <w:spacing w:lineRule="auto" w:line="360"/>
-              <w:jc w:val="center"/>
-              <w:rPr>
-                <w:color w:val="000000"/>
-                <w:sz w:val="22"/>
-                <w:szCs w:val="22"/>
-              </w:rPr>
-            </w:pPr>
-            <w:r>
-              <w:rPr>
-                <w:sz w:val="22"/>
-                <w:szCs w:val="22"/>
-              </w:rPr>
-              <w:t>QSFP28 100G FR Single Lambda Transceiver</w:t>
-            </w:r>
-          </w:p>
-        </w:tc>
-        <w:tc>
-          <w:tcPr>
-            <w:tcW w:w="744" w:type="dxa"/>
-            <w:tcBorders>
-              <w:top w:val="single" w:sz="4" w:space="0" w:color="000000"/>
-              <w:left w:val="single" w:sz="4" w:space="0" w:color="000000"/>
-              <w:bottom w:val="single" w:sz="4" w:space="0" w:color="000000"/>
-              <w:right w:val="single" w:sz="4" w:space="0" w:color="000000"/>
-            </w:tcBorders>
-            <w:vAlign w:val="center"/>
-          </w:tcPr>
-          <w:p>
-            <w:pPr>
-              <w:pStyle w:val="Normal"/>
-              <w:widowControl w:val="false"/>
-              <w:spacing w:lineRule="auto" w:line="360"/>
-              <w:jc w:val="center"/>
-              <w:rPr>
-                <w:color w:val="000000"/>
-                <w:sz w:val="22"/>
-                <w:szCs w:val="22"/>
-              </w:rPr>
-            </w:pPr>
-            <w:r>
-              <w:rPr>
-                <w:sz w:val="22"/>
-                <w:szCs w:val="22"/>
-              </w:rPr>
-              <w:t>4</w:t>
-            </w:r>
-            <w:bookmarkStart w:id="27" w:name="_MON_1814361177"/>
+              <w:t>${ceilQty}</w:t>
+            </w:r>
           </w:p>
         </w:tc>
       </w:tr>
@@ -6264,11 +5940,440 @@
         <w:jc w:val="center"/>
         <w:rPr/>
       </w:pPr>
-      <w:bookmarkEnd w:id="27"/>
+      <w:r>
+        <w:rPr/>
+      </w:r>
+      <w:bookmarkStart w:id="29" w:name="_MON_1814361177"/>
+      <w:bookmarkStart w:id="30" w:name="_MON_1814361177"/>
+      <w:bookmarkEnd w:id="30"/>
+    </w:p>
+    <w:p>
+      <w:pPr>
+        <w:pStyle w:val="1"/>
+        <w:spacing w:lineRule="auto" w:line="360"/>
+        <w:ind w:left="431" w:hanging="431"/>
+        <w:rPr/>
+      </w:pPr>
+      <w:bookmarkStart w:id="31" w:name="_Toc203748224"/>
+      <w:r>
+        <w:rPr/>
+        <w:t>SCOPE OF WORK</w:t>
+      </w:r>
+      <w:bookmarkEnd w:id="31"/>
+      <w:r>
+        <w:rPr/>
+        <w:t xml:space="preserve"> </w:t>
+      </w:r>
+    </w:p>
+    <w:p>
+      <w:pPr>
+        <w:pStyle w:val="2"/>
+        <w:spacing w:lineRule="auto" w:line="360" w:before="0" w:after="60"/>
+        <w:ind w:left="578" w:hanging="578"/>
+        <w:rPr>
+          <w:iCs w:val="false"/>
+        </w:rPr>
+      </w:pPr>
+      <w:bookmarkStart w:id="32" w:name="_Toc203748225"/>
+      <w:bookmarkStart w:id="33" w:name="_Toc112403418"/>
+      <w:r>
+        <w:rPr>
+          <w:iCs w:val="false"/>
+        </w:rPr>
+        <w:t>Installation/Migration/Decommissioning</w:t>
+      </w:r>
+      <w:bookmarkEnd w:id="32"/>
+      <w:bookmarkEnd w:id="33"/>
+    </w:p>
+    <w:p>
+      <w:pPr>
+        <w:pStyle w:val="3"/>
+        <w:spacing w:lineRule="auto" w:line="360" w:before="0" w:after="60"/>
+        <w:rPr/>
+      </w:pPr>
+      <w:bookmarkStart w:id="34" w:name="_Toc203748226"/>
+      <w:r>
+        <w:rPr/>
+        <w:t>Work Description/Details</w:t>
+      </w:r>
+      <w:bookmarkEnd w:id="34"/>
+    </w:p>
+    <w:p>
+      <w:pPr>
+        <w:pStyle w:val="ListParagraph"/>
+        <w:numPr>
+          <w:ilvl w:val="0"/>
+          <w:numId w:val="3"/>
+        </w:numPr>
+        <w:spacing w:lineRule="auto" w:line="360" w:before="0" w:after="0"/>
+        <w:ind w:left="851" w:hanging="284"/>
+        <w:contextualSpacing w:val="false"/>
+        <w:rPr/>
+      </w:pPr>
+      <w:r>
+        <w:rPr/>
+        <w:t>Request NCT for activities.</w:t>
+      </w:r>
+    </w:p>
+    <w:p>
+      <w:pPr>
+        <w:pStyle w:val="ListParagraph"/>
+        <w:numPr>
+          <w:ilvl w:val="0"/>
+          <w:numId w:val="3"/>
+        </w:numPr>
+        <w:spacing w:lineRule="auto" w:line="360" w:before="0" w:after="0"/>
+        <w:ind w:left="851" w:hanging="284"/>
+        <w:contextualSpacing w:val="false"/>
+        <w:rPr/>
+      </w:pPr>
+      <w:r>
+        <w:rPr/>
+        <w:t>Ensure all cables are on site and ready to be implemented.</w:t>
+      </w:r>
+    </w:p>
+    <w:p>
+      <w:pPr>
+        <w:pStyle w:val="ListParagraph"/>
+        <w:numPr>
+          <w:ilvl w:val="0"/>
+          <w:numId w:val="3"/>
+        </w:numPr>
+        <w:spacing w:lineRule="auto" w:line="360"/>
+        <w:ind w:left="851" w:hanging="284"/>
+        <w:rPr>
+          <w:b/>
+          <w:b/>
+          <w:u w:val="single"/>
+        </w:rPr>
+      </w:pPr>
+      <w:r>
+        <w:rPr/>
+        <w:t>Use electrostatic discharge (ESD) grounding strap when working with electronic equipment.</w:t>
+      </w:r>
+      <w:bookmarkStart w:id="35" w:name="_Toc2037482261"/>
+      <w:bookmarkEnd w:id="35"/>
+    </w:p>
+    <w:p>
+      <w:pPr>
+        <w:pStyle w:val="ListParagraph"/>
+        <w:spacing w:lineRule="auto" w:line="360"/>
+        <w:ind w:left="567" w:hanging="0"/>
+        <w:rPr>
+          <w:b w:val="false"/>
+          <w:b w:val="false"/>
+          <w:bCs w:val="false"/>
+          <w:u w:val="none"/>
+        </w:rPr>
+      </w:pPr>
+      <w:r>
+        <w:rPr>
+          <w:b w:val="false"/>
+          <w:bCs w:val="false"/>
+          <w:u w:val="none"/>
+        </w:rPr>
+        <w:t>$</w:t>
+      </w:r>
+      <w:r>
+        <w:rPr>
+          <w:b w:val="false"/>
+          <w:bCs w:val="false"/>
+          <w:u w:val="none"/>
+        </w:rPr>
+        <w:t>{</w:t>
+      </w:r>
+      <w:r>
+        <w:rPr>
+          <w:b w:val="false"/>
+          <w:bCs w:val="false"/>
+          <w:u w:val="none"/>
+        </w:rPr>
+        <w:t>workDescri</w:t>
+      </w:r>
+      <w:r>
+        <w:rPr>
+          <w:b w:val="false"/>
+          <w:bCs w:val="false"/>
+          <w:u w:val="none"/>
+        </w:rPr>
+        <w:t>p</w:t>
+      </w:r>
+      <w:r>
+        <w:rPr>
+          <w:b w:val="false"/>
+          <w:bCs w:val="false"/>
+          <w:u w:val="none"/>
+        </w:rPr>
+        <w:t>tion}</w:t>
+      </w:r>
+    </w:p>
+    <w:p>
+      <w:pPr>
+        <w:pStyle w:val="ListParagraph"/>
+        <w:spacing w:lineRule="auto" w:line="360"/>
+        <w:ind w:left="0" w:hanging="0"/>
+        <w:jc w:val="center"/>
+        <w:rPr>
+          <w:b/>
+          <w:b/>
+          <w:u w:val="single"/>
+        </w:rPr>
+      </w:pPr>
+      <w:r>
+        <w:rPr/>
+      </w:r>
+    </w:p>
+    <w:p>
+      <w:pPr>
+        <w:pStyle w:val="Normal"/>
+        <w:keepNext w:val="true"/>
+        <w:keepLines/>
+        <w:spacing w:lineRule="auto" w:line="360"/>
+        <w:jc w:val="both"/>
+        <w:rPr/>
+      </w:pPr>
+      <w:r>
+        <w:rPr/>
+      </w:r>
+    </w:p>
+    <w:p>
+      <w:pPr>
+        <w:pStyle w:val="Normal"/>
+        <w:keepNext w:val="true"/>
+        <w:keepLines/>
+        <w:spacing w:lineRule="auto" w:line="360"/>
+        <w:ind w:firstLine="567"/>
+        <w:jc w:val="both"/>
+        <w:rPr>
+          <w:b/>
+          <w:b/>
+          <w:bCs/>
+          <w:u w:val="single"/>
+        </w:rPr>
+      </w:pPr>
+      <w:r>
+        <w:rPr>
+          <w:b/>
+          <w:bCs/>
+          <w:u w:val="single"/>
+        </w:rPr>
+        <w:t>Hardware Description:</w:t>
+      </w:r>
+    </w:p>
+    <w:p>
+      <w:pPr>
+        <w:pStyle w:val="Normal"/>
+        <w:keepNext w:val="true"/>
+        <w:keepLines/>
+        <w:spacing w:lineRule="auto" w:line="360"/>
+        <w:ind w:left="431" w:hanging="0"/>
+        <w:jc w:val="center"/>
+        <w:rPr>
+          <w:lang w:val="en-US"/>
+        </w:rPr>
+      </w:pPr>
+      <w:r>
+        <w:rPr>
+          <w:lang w:val="en-US"/>
+        </w:rPr>
+        <w:t>${</w:t>
+      </w:r>
+      <w:r>
+        <w:rPr>
+          <w:lang w:val="en-US"/>
+        </w:rPr>
+        <w:t>diagram_hw</w:t>
+      </w:r>
+      <w:r>
+        <w:rPr>
+          <w:lang w:val="en-US"/>
+        </w:rPr>
+        <w:t>}</w:t>
+      </w:r>
+    </w:p>
+    <w:p>
+      <w:pPr>
+        <w:pStyle w:val="Caption"/>
+        <w:jc w:val="center"/>
+        <w:rPr/>
+      </w:pPr>
+      <w:r>
+        <w:rPr/>
+        <w:t xml:space="preserve">Figure </w:t>
+      </w:r>
+      <w:r>
+        <w:rPr/>
+        <w:fldChar w:fldCharType="begin"/>
+      </w:r>
+      <w:r>
+        <w:rPr/>
+        <w:instrText xml:space="preserve"> SEQ Фигура \* ARABIC </w:instrText>
+      </w:r>
+      <w:r>
+        <w:rPr/>
+        <w:fldChar w:fldCharType="separate"/>
+      </w:r>
+      <w:r>
+        <w:rPr/>
+        <w:t>1</w:t>
+      </w:r>
+      <w:r>
+        <w:rPr/>
+        <w:fldChar w:fldCharType="end"/>
+      </w:r>
+      <w:r>
+        <w:rPr/>
+        <w:t xml:space="preserve">: </w:t>
+      </w:r>
+      <w:r>
+        <w:rPr/>
+        <w:t>${hardwareCaption}</w:t>
+      </w:r>
+    </w:p>
+    <w:p>
+      <w:pPr>
+        <w:pStyle w:val="3"/>
+        <w:spacing w:lineRule="auto" w:line="360" w:before="0" w:after="60"/>
+        <w:rPr/>
+      </w:pPr>
+      <w:bookmarkStart w:id="36" w:name="_Toc203748227"/>
+      <w:r>
+        <w:rPr/>
+        <w:t>Cable Run List</w:t>
+      </w:r>
+      <w:bookmarkEnd w:id="36"/>
+    </w:p>
+    <w:p>
+      <w:pPr>
+        <w:pStyle w:val="Normal"/>
+        <w:spacing w:lineRule="auto" w:line="360"/>
+        <w:ind w:left="720" w:hanging="0"/>
+        <w:rPr>
+          <w:bCs/>
+        </w:rPr>
+      </w:pPr>
+      <w:r>
+        <w:rPr>
+          <w:bCs/>
+        </w:rPr>
+        <w:t>N/A</w:t>
+      </w:r>
+    </w:p>
+    <w:p>
+      <w:pPr>
+        <w:sectPr>
+          <w:headerReference w:type="default" r:id="rId11"/>
+          <w:footerReference w:type="default" r:id="rId12"/>
+          <w:type w:val="nextPage"/>
+          <w:pgSz w:w="12240" w:h="15840"/>
+          <w:pgMar w:left="992" w:right="902" w:gutter="0" w:header="720" w:top="1185" w:footer="720" w:bottom="1440"/>
+          <w:pgNumType w:fmt="decimal"/>
+          <w:formProt w:val="false"/>
+          <w:textDirection w:val="lrTb"/>
+          <w:docGrid w:type="default" w:linePitch="326" w:charSpace="0"/>
+        </w:sectPr>
+      </w:pPr>
+    </w:p>
+    <w:p>
+      <w:pPr>
+        <w:pStyle w:val="3"/>
+        <w:numPr>
+          <w:ilvl w:val="0"/>
+          <w:numId w:val="0"/>
+        </w:numPr>
+        <w:spacing w:lineRule="auto" w:line="360" w:before="0" w:after="60"/>
+        <w:ind w:left="0" w:hanging="0"/>
+        <w:rPr/>
+      </w:pPr>
+      <w:r>
+        <w:rPr/>
+      </w:r>
+    </w:p>
+    <w:p>
+      <w:pPr>
+        <w:sectPr>
+          <w:type w:val="continuous"/>
+          <w:pgSz w:w="12240" w:h="15840"/>
+          <w:pgMar w:left="992" w:right="902" w:gutter="0" w:header="720" w:top="1185" w:footer="720" w:bottom="1440"/>
+          <w:formProt w:val="false"/>
+          <w:textDirection w:val="lrTb"/>
+          <w:docGrid w:type="default" w:linePitch="326" w:charSpace="0"/>
+        </w:sectPr>
+      </w:pPr>
+    </w:p>
+    <w:p>
+      <w:pPr>
+        <w:pStyle w:val="3"/>
+        <w:numPr>
+          <w:ilvl w:val="0"/>
+          <w:numId w:val="0"/>
+        </w:numPr>
+        <w:spacing w:lineRule="auto" w:line="360" w:before="0" w:after="60"/>
+        <w:ind w:left="0" w:hanging="0"/>
+        <w:rPr/>
+      </w:pPr>
+      <w:r>
+        <w:rPr/>
+      </w:r>
+    </w:p>
+    <w:p>
+      <w:pPr>
+        <w:sectPr>
+          <w:type w:val="continuous"/>
+          <w:pgSz w:w="12240" w:h="15840"/>
+          <w:pgMar w:left="992" w:right="902" w:gutter="0" w:header="720" w:top="1185" w:footer="720" w:bottom="1440"/>
+          <w:formProt w:val="false"/>
+          <w:textDirection w:val="lrTb"/>
+          <w:docGrid w:type="default" w:linePitch="326" w:charSpace="0"/>
+        </w:sectPr>
+      </w:pPr>
+    </w:p>
+    <w:p>
+      <w:pPr>
+        <w:pStyle w:val="3"/>
+        <w:spacing w:lineRule="auto" w:line="360" w:before="0" w:after="60"/>
+        <w:rPr/>
+      </w:pPr>
+      <w:bookmarkStart w:id="37" w:name="_Toc203748228"/>
+      <w:r>
+        <w:rPr/>
+        <w:t>Rack Layout</w:t>
+      </w:r>
+      <w:bookmarkEnd w:id="37"/>
+    </w:p>
+    <w:p>
+      <w:pPr>
+        <w:pStyle w:val="Normal"/>
+        <w:spacing w:lineRule="auto" w:line="360"/>
+        <w:rPr>
+          <w:color w:val="FF0000"/>
+        </w:rPr>
+      </w:pPr>
+      <w:r>
+        <w:rPr>
+          <w:b/>
+          <w:color w:val="FF0000"/>
+        </w:rPr>
+        <w:t>Note:</w:t>
+      </w:r>
+      <w:r>
+        <w:rPr>
+          <w:color w:val="FF0000"/>
+        </w:rPr>
+        <w:t xml:space="preserve"> Right-click/ Double-click to open the files as a PDF Object.</w:t>
+      </w:r>
+    </w:p>
+    <w:p>
+      <w:pPr>
+        <w:pStyle w:val="Normal"/>
+        <w:spacing w:lineRule="auto" w:line="360"/>
+        <w:jc w:val="center"/>
+        <w:rPr/>
+      </w:pPr>
       <w:r>
         <w:rPr/>
         <w:object>
-          <v:shapetype id="_x0000_tole_rId11" coordsize="21600,21600" o:spt="ole_rId11" o:preferrelative="t" path="m@4@5l@4@11@9@11@9@5xe" filled="f" stroked="f">
+          <v:shapetype id="_x0000_tole_rId13" coordsize="21600,21600" o:spt="ole_rId13" o:preferrelative="t" path="m@4@5l@4@11@9@11@9@5xe" filled="f" stroked="f">
             <v:stroke joinstyle="miter"/>
             <v:formulas>
               <v:f eqn="if lineDrawn pixelLineWidth 0"/>
@@ -6287,920 +6392,11 @@
             <v:path o:extrusionok="f" gradientshapeok="t" o:connecttype="rect"/>
             <o:lock v:ext="edit" aspectratio="t"/>
           </v:shapetype>
-          <v:shape id="ole_rId11" type="_x0000_tole_rId11" style="width:78.55pt;height:52.35pt;mso-wrap-distance-right:0pt" filled="f" o:ole="">
-            <v:imagedata r:id="rId12" o:title=""/>
+          <v:shape id="ole_rId13" type="_x0000_tole_rId13" style="width:392.75pt;height:608.75pt;mso-wrap-distance-right:0pt" filled="f" o:ole="">
+            <v:imagedata r:id="rId14" o:title=""/>
           </v:shape>
-          <o:OLEObject Type="Embed" ProgID="Excel.Sheet.12" ShapeID="ole_rId11" DrawAspect="Icon" ObjectID="_495614922" r:id="rId11"/>
+          <o:OLEObject Type="Embed" ProgID="Acrobat.Document.DC" ShapeID="ole_rId13" DrawAspect="Content" ObjectID="_714599374" r:id="rId13"/>
         </w:object>
-      </w:r>
-    </w:p>
-    <w:p>
-      <w:pPr>
-        <w:pStyle w:val="1"/>
-        <w:spacing w:lineRule="auto" w:line="360"/>
-        <w:ind w:left="431" w:hanging="431"/>
-        <w:rPr/>
-      </w:pPr>
-      <w:bookmarkStart w:id="28" w:name="_Toc203748224"/>
-      <w:r>
-        <w:rPr/>
-        <w:t>SCOPE OF WORK</w:t>
-      </w:r>
-      <w:bookmarkEnd w:id="28"/>
-      <w:r>
-        <w:rPr/>
-        <w:t xml:space="preserve"> </w:t>
-      </w:r>
-    </w:p>
-    <w:p>
-      <w:pPr>
-        <w:pStyle w:val="2"/>
-        <w:spacing w:lineRule="auto" w:line="360" w:before="0" w:after="60"/>
-        <w:ind w:left="578" w:hanging="578"/>
-        <w:rPr>
-          <w:iCs w:val="false"/>
-        </w:rPr>
-      </w:pPr>
-      <w:bookmarkStart w:id="29" w:name="_Toc112403418"/>
-      <w:bookmarkStart w:id="30" w:name="_Toc203748225"/>
-      <w:r>
-        <w:rPr>
-          <w:iCs w:val="false"/>
-        </w:rPr>
-        <w:t>Installation/Migration/Decommissioning</w:t>
-      </w:r>
-      <w:bookmarkEnd w:id="29"/>
-      <w:bookmarkEnd w:id="30"/>
-    </w:p>
-    <w:p>
-      <w:pPr>
-        <w:pStyle w:val="3"/>
-        <w:spacing w:lineRule="auto" w:line="360" w:before="0" w:after="60"/>
-        <w:rPr/>
-      </w:pPr>
-      <w:bookmarkStart w:id="31" w:name="_Toc203748226"/>
-      <w:r>
-        <w:rPr/>
-        <w:t>Work Description/Details</w:t>
-      </w:r>
-      <w:bookmarkEnd w:id="31"/>
-    </w:p>
-    <w:p>
-      <w:pPr>
-        <w:pStyle w:val="ListParagraph"/>
-        <w:numPr>
-          <w:ilvl w:val="0"/>
-          <w:numId w:val="3"/>
-        </w:numPr>
-        <w:spacing w:lineRule="auto" w:line="360" w:before="0" w:after="0"/>
-        <w:ind w:left="851" w:hanging="284"/>
-        <w:contextualSpacing w:val="false"/>
-        <w:rPr/>
-      </w:pPr>
-      <w:r>
-        <w:rPr/>
-        <w:t>Request NCT for activities.</w:t>
-      </w:r>
-    </w:p>
-    <w:p>
-      <w:pPr>
-        <w:pStyle w:val="ListParagraph"/>
-        <w:numPr>
-          <w:ilvl w:val="0"/>
-          <w:numId w:val="3"/>
-        </w:numPr>
-        <w:spacing w:lineRule="auto" w:line="360" w:before="0" w:after="0"/>
-        <w:ind w:left="851" w:hanging="284"/>
-        <w:contextualSpacing w:val="false"/>
-        <w:rPr/>
-      </w:pPr>
-      <w:r>
-        <w:rPr/>
-        <w:t>Ensure all cables are on site and ready to be implemented.</w:t>
-      </w:r>
-    </w:p>
-    <w:p>
-      <w:pPr>
-        <w:pStyle w:val="ListParagraph"/>
-        <w:numPr>
-          <w:ilvl w:val="0"/>
-          <w:numId w:val="3"/>
-        </w:numPr>
-        <w:spacing w:lineRule="auto" w:line="360"/>
-        <w:ind w:left="851" w:hanging="284"/>
-        <w:rPr>
-          <w:b/>
-          <w:b/>
-          <w:u w:val="single"/>
-        </w:rPr>
-      </w:pPr>
-      <w:r>
-        <w:rPr/>
-        <w:t>Use electrostatic discharge (ESD) grounding strap when working with electronic equipment.</w:t>
-      </w:r>
-    </w:p>
-    <w:p>
-      <w:pPr>
-        <w:pStyle w:val="ListParagraph"/>
-        <w:spacing w:lineRule="auto" w:line="360"/>
-        <w:ind w:left="0" w:hanging="0"/>
-        <w:jc w:val="center"/>
-        <w:rPr>
-          <w:b/>
-          <w:b/>
-          <w:u w:val="single"/>
-        </w:rPr>
-      </w:pPr>
-      <w:r>
-        <w:rPr>
-          <w:b/>
-          <w:u w:val="single"/>
-        </w:rPr>
-        <w:t>RACK 1110</w:t>
-      </w:r>
-    </w:p>
-    <w:p>
-      <w:pPr>
-        <w:pStyle w:val="ListParagraph"/>
-        <w:numPr>
-          <w:ilvl w:val="0"/>
-          <w:numId w:val="3"/>
-        </w:numPr>
-        <w:spacing w:lineRule="auto" w:line="360"/>
-        <w:ind w:left="851" w:hanging="284"/>
-        <w:jc w:val="both"/>
-        <w:rPr>
-          <w:rFonts w:cs="Times New Roman"/>
-          <w:b/>
-          <w:b/>
-          <w:color w:val="0000FF"/>
-          <w:szCs w:val="20"/>
-        </w:rPr>
-      </w:pPr>
-      <w:r>
-        <w:rPr>
-          <w:b/>
-        </w:rPr>
-        <w:t>RU03:</w:t>
-      </w:r>
-      <w:r>
-        <w:rPr>
-          <w:bCs/>
-        </w:rPr>
-        <w:t xml:space="preserve"> Locate existing Juniper MX960-PREMIUM-DC-ECM chassis labelled as “</w:t>
-      </w:r>
-      <w:r>
-        <w:rPr>
-          <w:b/>
-        </w:rPr>
-        <w:t>DGW71.NFSJ</w:t>
-      </w:r>
-      <w:r>
-        <w:rPr>
-          <w:bCs/>
-        </w:rPr>
-        <w:t>”.</w:t>
-      </w:r>
-    </w:p>
-    <w:p>
-      <w:pPr>
-        <w:pStyle w:val="ListParagraph"/>
-        <w:numPr>
-          <w:ilvl w:val="2"/>
-          <w:numId w:val="3"/>
-        </w:numPr>
-        <w:spacing w:lineRule="auto" w:line="360"/>
-        <w:jc w:val="both"/>
-        <w:rPr>
-          <w:rFonts w:cs="Times New Roman"/>
-          <w:b/>
-          <w:b/>
-          <w:color w:val="0000FF"/>
-          <w:szCs w:val="20"/>
-        </w:rPr>
-      </w:pPr>
-      <w:r>
-        <w:rPr>
-          <w:b/>
-          <w:color w:val="0000FF"/>
-        </w:rPr>
-        <w:t>Slot 05:</w:t>
-      </w:r>
-      <w:r>
-        <w:rPr>
-          <w:b/>
-        </w:rPr>
-        <w:t xml:space="preserve"> </w:t>
-      </w:r>
-      <w:r>
-        <w:rPr>
-          <w:bCs/>
-        </w:rPr>
-        <w:t xml:space="preserve">Install </w:t>
-      </w:r>
-      <w:r>
-        <w:rPr>
-          <w:b/>
-          <w:color w:val="0000FF"/>
-        </w:rPr>
-        <w:t>1x</w:t>
-      </w:r>
-      <w:r>
-        <w:rPr>
-          <w:bCs/>
-        </w:rPr>
-        <w:t xml:space="preserve"> 10G/40G/100G QSFP28. </w:t>
-      </w:r>
-      <w:r>
-        <w:rPr>
-          <w:b/>
-        </w:rPr>
-        <w:t>(Part#</w:t>
-      </w:r>
-      <w:r>
-        <w:rPr/>
-        <w:t xml:space="preserve"> </w:t>
-      </w:r>
-      <w:r>
-        <w:rPr>
-          <w:b/>
-        </w:rPr>
-        <w:t>MPC7E-MRATE).</w:t>
-      </w:r>
-    </w:p>
-    <w:p>
-      <w:pPr>
-        <w:pStyle w:val="ListParagraph"/>
-        <w:numPr>
-          <w:ilvl w:val="3"/>
-          <w:numId w:val="3"/>
-        </w:numPr>
-        <w:spacing w:lineRule="auto" w:line="360"/>
-        <w:jc w:val="both"/>
-        <w:rPr>
-          <w:rFonts w:cs="Times New Roman"/>
-          <w:b/>
-          <w:b/>
-          <w:color w:val="0000FF"/>
-          <w:szCs w:val="20"/>
-        </w:rPr>
-      </w:pPr>
-      <w:r>
-        <w:rPr>
-          <w:b/>
-          <w:color w:val="0000FF"/>
-          <w:lang w:val="fr-FR"/>
-        </w:rPr>
-        <w:t xml:space="preserve">Port Et-5/0/2, &amp; Et-5/0/5: </w:t>
-      </w:r>
-      <w:r>
-        <w:rPr>
-          <w:bCs/>
-          <w:lang w:val="fr-FR"/>
-        </w:rPr>
-        <w:t xml:space="preserve">Install </w:t>
-      </w:r>
-      <w:r>
-        <w:rPr>
-          <w:b/>
-          <w:color w:val="0000FF"/>
-          <w:lang w:val="fr-FR"/>
-        </w:rPr>
-        <w:t>2x</w:t>
-      </w:r>
-      <w:r>
-        <w:rPr>
-          <w:bCs/>
-          <w:lang w:val="fr-FR"/>
-        </w:rPr>
-        <w:t xml:space="preserve"> QSFP28 100G FR Single Lambda Transceiver. </w:t>
-      </w:r>
-      <w:r>
-        <w:rPr>
-          <w:b/>
-        </w:rPr>
-        <w:t>(Part#</w:t>
-      </w:r>
-      <w:r>
-        <w:rPr/>
-        <w:t xml:space="preserve"> </w:t>
-      </w:r>
-      <w:r>
-        <w:rPr>
-          <w:b/>
-        </w:rPr>
-        <w:t>QSFP-100G-FR).</w:t>
-      </w:r>
-      <w:r>
-        <w:rPr>
-          <w:bCs/>
-        </w:rPr>
-        <w:t xml:space="preserve"> </w:t>
-      </w:r>
-    </w:p>
-    <w:p>
-      <w:pPr>
-        <w:pStyle w:val="ListParagraph"/>
-        <w:numPr>
-          <w:ilvl w:val="3"/>
-          <w:numId w:val="3"/>
-        </w:numPr>
-        <w:spacing w:lineRule="auto" w:line="360"/>
-        <w:jc w:val="both"/>
-        <w:rPr>
-          <w:rFonts w:cs="Times New Roman"/>
-          <w:b/>
-          <w:b/>
-          <w:color w:val="0000FF"/>
-          <w:szCs w:val="20"/>
-        </w:rPr>
-      </w:pPr>
-      <w:r>
-        <w:rPr>
-          <w:b/>
-          <w:color w:val="0000FF"/>
-          <w:lang w:val="fr-FR"/>
-        </w:rPr>
-        <w:t xml:space="preserve">Port Et-5/1/2, &amp; Et-5/1/5: </w:t>
-      </w:r>
-      <w:r>
-        <w:rPr>
-          <w:bCs/>
-          <w:lang w:val="fr-FR"/>
-        </w:rPr>
-        <w:t xml:space="preserve">Install </w:t>
-      </w:r>
-      <w:r>
-        <w:rPr>
-          <w:b/>
-          <w:color w:val="0000FF"/>
-          <w:lang w:val="fr-FR"/>
-        </w:rPr>
-        <w:t>2x</w:t>
-      </w:r>
-      <w:r>
-        <w:rPr>
-          <w:bCs/>
-          <w:lang w:val="fr-FR"/>
-        </w:rPr>
-        <w:t xml:space="preserve"> QSFP-28, 100G-SR4 Transceiver. </w:t>
-      </w:r>
-      <w:r>
-        <w:rPr>
-          <w:b/>
-        </w:rPr>
-        <w:t>(Part#</w:t>
-      </w:r>
-      <w:r>
-        <w:rPr/>
-        <w:t xml:space="preserve"> </w:t>
-      </w:r>
-      <w:r>
-        <w:rPr>
-          <w:b/>
-        </w:rPr>
-        <w:t>QSFP-100G-SR4-C).</w:t>
-      </w:r>
-    </w:p>
-    <w:p>
-      <w:pPr>
-        <w:pStyle w:val="ListParagraph"/>
-        <w:keepNext w:val="true"/>
-        <w:keepLines/>
-        <w:spacing w:lineRule="auto" w:line="360"/>
-        <w:ind w:left="0" w:hanging="0"/>
-        <w:jc w:val="center"/>
-        <w:rPr>
-          <w:b/>
-          <w:b/>
-          <w:u w:val="single"/>
-        </w:rPr>
-      </w:pPr>
-      <w:r>
-        <w:rPr>
-          <w:b/>
-          <w:u w:val="single"/>
-        </w:rPr>
-        <w:t>RACK 1104</w:t>
-      </w:r>
-    </w:p>
-    <w:p>
-      <w:pPr>
-        <w:pStyle w:val="ListParagraph"/>
-        <w:keepNext w:val="true"/>
-        <w:keepLines/>
-        <w:numPr>
-          <w:ilvl w:val="0"/>
-          <w:numId w:val="3"/>
-        </w:numPr>
-        <w:spacing w:lineRule="auto" w:line="360"/>
-        <w:ind w:left="851" w:hanging="284"/>
-        <w:jc w:val="both"/>
-        <w:rPr>
-          <w:rFonts w:cs="Times New Roman"/>
-          <w:b/>
-          <w:b/>
-          <w:color w:val="0000FF"/>
-          <w:szCs w:val="20"/>
-        </w:rPr>
-      </w:pPr>
-      <w:r>
-        <w:rPr>
-          <w:b/>
-        </w:rPr>
-        <w:t>RU03:</w:t>
-      </w:r>
-      <w:r>
-        <w:rPr>
-          <w:bCs/>
-        </w:rPr>
-        <w:t xml:space="preserve"> Locate existing Juniper MX960-PREMIUM-DC-ECM chassis labelled as “</w:t>
-      </w:r>
-      <w:r>
-        <w:rPr>
-          <w:b/>
-        </w:rPr>
-        <w:t>DGW70.NFSJ</w:t>
-      </w:r>
-      <w:r>
-        <w:rPr>
-          <w:bCs/>
-        </w:rPr>
-        <w:t>”.</w:t>
-      </w:r>
-    </w:p>
-    <w:p>
-      <w:pPr>
-        <w:pStyle w:val="ListParagraph"/>
-        <w:keepNext w:val="true"/>
-        <w:keepLines/>
-        <w:numPr>
-          <w:ilvl w:val="2"/>
-          <w:numId w:val="3"/>
-        </w:numPr>
-        <w:spacing w:lineRule="auto" w:line="360"/>
-        <w:jc w:val="both"/>
-        <w:rPr>
-          <w:rFonts w:cs="Times New Roman"/>
-          <w:b/>
-          <w:b/>
-          <w:color w:val="0000FF"/>
-          <w:szCs w:val="20"/>
-        </w:rPr>
-      </w:pPr>
-      <w:r>
-        <w:rPr>
-          <w:b/>
-          <w:color w:val="0000FF"/>
-        </w:rPr>
-        <w:t>Slot 05:</w:t>
-      </w:r>
-      <w:r>
-        <w:rPr>
-          <w:b/>
-        </w:rPr>
-        <w:t xml:space="preserve"> </w:t>
-      </w:r>
-      <w:r>
-        <w:rPr>
-          <w:bCs/>
-        </w:rPr>
-        <w:t xml:space="preserve">Install </w:t>
-      </w:r>
-      <w:r>
-        <w:rPr>
-          <w:b/>
-          <w:color w:val="0000FF"/>
-        </w:rPr>
-        <w:t>1x</w:t>
-      </w:r>
-      <w:r>
-        <w:rPr>
-          <w:bCs/>
-        </w:rPr>
-        <w:t xml:space="preserve"> 10G/40G/100G QSFP28. </w:t>
-      </w:r>
-      <w:r>
-        <w:rPr>
-          <w:b/>
-        </w:rPr>
-        <w:t>(Part#</w:t>
-      </w:r>
-      <w:r>
-        <w:rPr/>
-        <w:t xml:space="preserve"> </w:t>
-      </w:r>
-      <w:r>
-        <w:rPr>
-          <w:b/>
-        </w:rPr>
-        <w:t>MPC7E-MRATE).</w:t>
-      </w:r>
-    </w:p>
-    <w:p>
-      <w:pPr>
-        <w:pStyle w:val="ListParagraph"/>
-        <w:keepNext w:val="true"/>
-        <w:keepLines/>
-        <w:numPr>
-          <w:ilvl w:val="3"/>
-          <w:numId w:val="3"/>
-        </w:numPr>
-        <w:spacing w:lineRule="auto" w:line="360"/>
-        <w:jc w:val="both"/>
-        <w:rPr>
-          <w:rFonts w:cs="Times New Roman"/>
-          <w:b/>
-          <w:b/>
-          <w:color w:val="0000FF"/>
-          <w:szCs w:val="20"/>
-        </w:rPr>
-      </w:pPr>
-      <w:r>
-        <w:rPr>
-          <w:b/>
-          <w:color w:val="0000FF"/>
-          <w:lang w:val="fr-FR"/>
-        </w:rPr>
-        <w:t xml:space="preserve">Port Et-5/0/2, &amp; Et-5/0/5: </w:t>
-      </w:r>
-      <w:r>
-        <w:rPr>
-          <w:bCs/>
-          <w:lang w:val="fr-FR"/>
-        </w:rPr>
-        <w:t xml:space="preserve">Install </w:t>
-      </w:r>
-      <w:r>
-        <w:rPr>
-          <w:b/>
-          <w:color w:val="0000FF"/>
-          <w:lang w:val="fr-FR"/>
-        </w:rPr>
-        <w:t>2x</w:t>
-      </w:r>
-      <w:r>
-        <w:rPr>
-          <w:bCs/>
-          <w:lang w:val="fr-FR"/>
-        </w:rPr>
-        <w:t xml:space="preserve"> QSFP28 100G FR Single Lambda Transceiver. </w:t>
-      </w:r>
-      <w:r>
-        <w:rPr>
-          <w:b/>
-        </w:rPr>
-        <w:t>(Part#</w:t>
-      </w:r>
-      <w:r>
-        <w:rPr/>
-        <w:t xml:space="preserve"> </w:t>
-      </w:r>
-      <w:r>
-        <w:rPr>
-          <w:b/>
-        </w:rPr>
-        <w:t>QSFP-100G-FR).</w:t>
-      </w:r>
-      <w:r>
-        <w:rPr>
-          <w:bCs/>
-        </w:rPr>
-        <w:t xml:space="preserve"> </w:t>
-      </w:r>
-    </w:p>
-    <w:p>
-      <w:pPr>
-        <w:pStyle w:val="ListParagraph"/>
-        <w:keepNext w:val="true"/>
-        <w:keepLines/>
-        <w:numPr>
-          <w:ilvl w:val="3"/>
-          <w:numId w:val="3"/>
-        </w:numPr>
-        <w:spacing w:lineRule="auto" w:line="360"/>
-        <w:jc w:val="both"/>
-        <w:rPr/>
-      </w:pPr>
-      <w:r>
-        <w:rPr>
-          <w:b/>
-          <w:color w:val="0000FF"/>
-          <w:lang w:val="fr-FR"/>
-        </w:rPr>
-        <w:t xml:space="preserve">Port Et-5/1/2, &amp; Et-5/1/5: </w:t>
-      </w:r>
-      <w:r>
-        <w:rPr>
-          <w:bCs/>
-          <w:lang w:val="fr-FR"/>
-        </w:rPr>
-        <w:t xml:space="preserve">Install </w:t>
-      </w:r>
-      <w:r>
-        <w:rPr>
-          <w:b/>
-          <w:color w:val="0000FF"/>
-          <w:lang w:val="fr-FR"/>
-        </w:rPr>
-        <w:t>2x</w:t>
-      </w:r>
-      <w:r>
-        <w:rPr>
-          <w:bCs/>
-          <w:lang w:val="fr-FR"/>
-        </w:rPr>
-        <w:t xml:space="preserve"> QSFP-28, 100G-SR4 Transceiver. </w:t>
-      </w:r>
-      <w:r>
-        <w:rPr>
-          <w:b/>
-        </w:rPr>
-        <w:t>(Part#</w:t>
-      </w:r>
-      <w:r>
-        <w:rPr/>
-        <w:t xml:space="preserve"> </w:t>
-      </w:r>
-      <w:r>
-        <w:rPr>
-          <w:b/>
-        </w:rPr>
-        <w:t>QSFP-100G-SR4-C).</w:t>
-      </w:r>
-    </w:p>
-    <w:p>
-      <w:pPr>
-        <w:pStyle w:val="ListParagraph"/>
-        <w:keepNext w:val="true"/>
-        <w:keepLines/>
-        <w:numPr>
-          <w:ilvl w:val="0"/>
-          <w:numId w:val="3"/>
-        </w:numPr>
-        <w:spacing w:lineRule="auto" w:line="360"/>
-        <w:ind w:left="851" w:hanging="284"/>
-        <w:jc w:val="both"/>
-        <w:rPr/>
-      </w:pPr>
-      <w:r>
-        <w:rPr/>
-        <w:t>Call NOC to close the ticket.</w:t>
-      </w:r>
-    </w:p>
-    <w:p>
-      <w:pPr>
-        <w:pStyle w:val="Normal"/>
-        <w:keepNext w:val="true"/>
-        <w:keepLines/>
-        <w:spacing w:lineRule="auto" w:line="360"/>
-        <w:jc w:val="both"/>
-        <w:rPr/>
-      </w:pPr>
-      <w:r>
-        <w:rPr/>
-      </w:r>
-    </w:p>
-    <w:p>
-      <w:pPr>
-        <w:pStyle w:val="Normal"/>
-        <w:keepNext w:val="true"/>
-        <w:keepLines/>
-        <w:spacing w:lineRule="auto" w:line="360"/>
-        <w:ind w:firstLine="567"/>
-        <w:jc w:val="both"/>
-        <w:rPr>
-          <w:b/>
-          <w:b/>
-          <w:bCs/>
-          <w:u w:val="single"/>
-        </w:rPr>
-      </w:pPr>
-      <w:r>
-        <w:rPr>
-          <w:b/>
-          <w:bCs/>
-          <w:u w:val="single"/>
-        </w:rPr>
-        <w:t>Hardware Description:</w:t>
-      </w:r>
-    </w:p>
-    <w:p>
-      <w:pPr>
-        <w:pStyle w:val="Normal"/>
-        <w:keepNext w:val="true"/>
-        <w:keepLines/>
-        <w:spacing w:lineRule="auto" w:line="360"/>
-        <w:jc w:val="center"/>
-        <w:rPr/>
-      </w:pPr>
-      <w:r>
-        <w:rPr/>
-        <w:drawing>
-          <wp:inline distT="0" distB="0" distL="0" distR="0">
-            <wp:extent cx="6457950" cy="1276350"/>
-            <wp:effectExtent l="0" t="0" r="0" b="0"/>
-            <wp:docPr id="6" name="Picture 1289794832" descr=""/>
-            <wp:cNvGraphicFramePr>
-              <a:graphicFrameLocks xmlns:a="http://schemas.openxmlformats.org/drawingml/2006/main" noChangeAspect="1"/>
-            </wp:cNvGraphicFramePr>
-            <a:graphic xmlns:a="http://schemas.openxmlformats.org/drawingml/2006/main">
-              <a:graphicData uri="http://schemas.openxmlformats.org/drawingml/2006/picture">
-                <pic:pic xmlns:pic="http://schemas.openxmlformats.org/drawingml/2006/picture">
-                  <pic:nvPicPr>
-                    <pic:cNvPr id="6" name="Picture 1289794832" descr=""/>
-                    <pic:cNvPicPr>
-                      <a:picLocks noChangeAspect="1" noChangeArrowheads="1"/>
-                    </pic:cNvPicPr>
-                  </pic:nvPicPr>
-                  <pic:blipFill>
-                    <a:blip r:embed="rId13"/>
-                    <a:stretch>
-                      <a:fillRect/>
-                    </a:stretch>
-                  </pic:blipFill>
-                  <pic:spPr bwMode="auto">
-                    <a:xfrm>
-                      <a:off x="0" y="0"/>
-                      <a:ext cx="6457950" cy="1276350"/>
-                    </a:xfrm>
-                    <a:prstGeom prst="rect">
-                      <a:avLst/>
-                    </a:prstGeom>
-                  </pic:spPr>
-                </pic:pic>
-              </a:graphicData>
-            </a:graphic>
-          </wp:inline>
-        </w:drawing>
-      </w:r>
-    </w:p>
-    <w:p>
-      <w:pPr>
-        <w:pStyle w:val="Caption"/>
-        <w:jc w:val="center"/>
-        <w:rPr/>
-      </w:pPr>
-      <w:r>
-        <w:rPr/>
-        <w:t xml:space="preserve">Figure </w:t>
-      </w:r>
-      <w:r>
-        <w:rPr/>
-        <w:fldChar w:fldCharType="begin"/>
-      </w:r>
-      <w:r>
-        <w:rPr/>
-        <w:instrText xml:space="preserve"> SEQ Фигура \* ARABIC </w:instrText>
-      </w:r>
-      <w:r>
-        <w:rPr/>
-        <w:fldChar w:fldCharType="separate"/>
-      </w:r>
-      <w:r>
-        <w:rPr/>
-        <w:t>1</w:t>
-      </w:r>
-      <w:r>
-        <w:rPr/>
-        <w:fldChar w:fldCharType="end"/>
-      </w:r>
-      <w:r>
-        <w:rPr/>
-        <w:t>: MPC7E line card</w:t>
-      </w:r>
-    </w:p>
-    <w:p>
-      <w:pPr>
-        <w:pStyle w:val="3"/>
-        <w:spacing w:lineRule="auto" w:line="360" w:before="0" w:after="60"/>
-        <w:rPr/>
-      </w:pPr>
-      <w:bookmarkStart w:id="32" w:name="_Toc203748227"/>
-      <w:r>
-        <w:rPr/>
-        <w:t>Cable Run List</w:t>
-      </w:r>
-      <w:bookmarkEnd w:id="32"/>
-    </w:p>
-    <w:p>
-      <w:pPr>
-        <w:pStyle w:val="Normal"/>
-        <w:spacing w:lineRule="auto" w:line="360"/>
-        <w:ind w:left="720" w:hanging="0"/>
-        <w:rPr>
-          <w:bCs/>
-        </w:rPr>
-      </w:pPr>
-      <w:r>
-        <w:rPr>
-          <w:bCs/>
-        </w:rPr>
-        <w:t>N/A</w:t>
-      </w:r>
-    </w:p>
-    <w:p>
-      <w:pPr>
-        <w:sectPr>
-          <w:headerReference w:type="default" r:id="rId14"/>
-          <w:footerReference w:type="default" r:id="rId15"/>
-          <w:type w:val="nextPage"/>
-          <w:pgSz w:w="12240" w:h="15840"/>
-          <w:pgMar w:left="992" w:right="902" w:gutter="0" w:header="720" w:top="1185" w:footer="720" w:bottom="1440"/>
-          <w:pgNumType w:fmt="decimal"/>
-          <w:formProt w:val="false"/>
-          <w:textDirection w:val="lrTb"/>
-          <w:docGrid w:type="default" w:linePitch="326" w:charSpace="0"/>
-        </w:sectPr>
-      </w:pPr>
-    </w:p>
-    <w:p>
-      <w:pPr>
-        <w:pStyle w:val="3"/>
-        <w:numPr>
-          <w:ilvl w:val="0"/>
-          <w:numId w:val="0"/>
-        </w:numPr>
-        <w:spacing w:lineRule="auto" w:line="360" w:before="0" w:after="60"/>
-        <w:ind w:left="0" w:hanging="0"/>
-        <w:rPr/>
-      </w:pPr>
-      <w:r>
-        <w:rPr/>
-      </w:r>
-    </w:p>
-    <w:p>
-      <w:pPr>
-        <w:sectPr>
-          <w:type w:val="continuous"/>
-          <w:pgSz w:w="12240" w:h="15840"/>
-          <w:pgMar w:left="992" w:right="902" w:gutter="0" w:header="720" w:top="1185" w:footer="720" w:bottom="1440"/>
-          <w:formProt w:val="false"/>
-          <w:textDirection w:val="lrTb"/>
-          <w:docGrid w:type="default" w:linePitch="326" w:charSpace="0"/>
-        </w:sectPr>
-      </w:pPr>
-    </w:p>
-    <w:p>
-      <w:pPr>
-        <w:pStyle w:val="3"/>
-        <w:numPr>
-          <w:ilvl w:val="0"/>
-          <w:numId w:val="0"/>
-        </w:numPr>
-        <w:spacing w:lineRule="auto" w:line="360" w:before="0" w:after="60"/>
-        <w:ind w:left="0" w:hanging="0"/>
-        <w:rPr/>
-      </w:pPr>
-      <w:r>
-        <w:rPr/>
-      </w:r>
-    </w:p>
-    <w:p>
-      <w:pPr>
-        <w:sectPr>
-          <w:type w:val="continuous"/>
-          <w:pgSz w:w="12240" w:h="15840"/>
-          <w:pgMar w:left="992" w:right="902" w:gutter="0" w:header="720" w:top="1185" w:footer="720" w:bottom="1440"/>
-          <w:formProt w:val="false"/>
-          <w:textDirection w:val="lrTb"/>
-          <w:docGrid w:type="default" w:linePitch="326" w:charSpace="0"/>
-        </w:sectPr>
-      </w:pPr>
-    </w:p>
-    <w:p>
-      <w:pPr>
-        <w:pStyle w:val="3"/>
-        <w:spacing w:lineRule="auto" w:line="360" w:before="0" w:after="60"/>
-        <w:rPr/>
-      </w:pPr>
-      <w:bookmarkStart w:id="33" w:name="_Toc203748228"/>
-      <w:r>
-        <w:rPr/>
-        <w:t>Rack Layout</w:t>
-      </w:r>
-      <w:bookmarkEnd w:id="33"/>
-    </w:p>
-    <w:p>
-      <w:pPr>
-        <w:pStyle w:val="Normal"/>
-        <w:spacing w:lineRule="auto" w:line="360"/>
-        <w:rPr>
-          <w:color w:val="FF0000"/>
-        </w:rPr>
-      </w:pPr>
-      <w:r>
-        <w:rPr>
-          <w:b/>
-          <w:color w:val="FF0000"/>
-        </w:rPr>
-        <w:t>Note:</w:t>
-      </w:r>
-      <w:r>
-        <w:rPr>
-          <w:color w:val="FF0000"/>
-        </w:rPr>
-        <w:t xml:space="preserve"> Right-click/ Double-click to open the files as a PDF Object.</w:t>
       </w:r>
     </w:p>
     <w:p>
@@ -7213,7 +6409,7 @@
       <w:r>
         <w:rPr/>
         <w:object>
-          <v:shapetype id="_x0000_tole_rId16" coordsize="21600,21600" o:spt="ole_rId16" o:preferrelative="t" path="m@4@5l@4@11@9@11@9@5xe" filled="f" stroked="f">
+          <v:shapetype id="_x0000_tole_rId15" coordsize="21600,21600" o:spt="ole_rId15" o:preferrelative="t" path="m@4@5l@4@11@9@11@9@5xe" filled="f" stroked="f">
             <v:stroke joinstyle="miter"/>
             <v:formulas>
               <v:f eqn="if lineDrawn pixelLineWidth 0"/>
@@ -7232,11 +6428,55 @@
             <v:path o:extrusionok="f" gradientshapeok="t" o:connecttype="rect"/>
             <o:lock v:ext="edit" aspectratio="t"/>
           </v:shapetype>
-          <v:shape id="ole_rId16" type="_x0000_tole_rId16" style="width:392.75pt;height:608.75pt;mso-wrap-distance-right:0pt" filled="f" o:ole="">
-            <v:imagedata r:id="rId17" o:title=""/>
+          <v:shape id="ole_rId15" type="_x0000_tole_rId15" style="width:425.45pt;height:654.55pt;mso-wrap-distance-right:0pt" filled="f" o:ole="">
+            <v:imagedata r:id="rId16" o:title=""/>
           </v:shape>
-          <o:OLEObject Type="Embed" ProgID="Acrobat.Document.DC" ShapeID="ole_rId16" DrawAspect="Content" ObjectID="_2122145784" r:id="rId16"/>
+          <o:OLEObject Type="Embed" ProgID="Acrobat.Document.DC" ShapeID="ole_rId15" DrawAspect="Content" ObjectID="_1722326146" r:id="rId15"/>
         </w:object>
+      </w:r>
+    </w:p>
+    <w:p>
+      <w:pPr>
+        <w:pStyle w:val="Normal"/>
+        <w:ind w:left="720" w:hanging="0"/>
+        <w:jc w:val="center"/>
+        <w:rPr/>
+      </w:pPr>
+      <w:r>
+        <w:rPr/>
+      </w:r>
+    </w:p>
+    <w:p>
+      <w:pPr>
+        <w:pStyle w:val="3"/>
+        <w:spacing w:lineRule="auto" w:line="360" w:before="0" w:after="60"/>
+        <w:rPr/>
+      </w:pPr>
+      <w:bookmarkStart w:id="38" w:name="_Toc203748229"/>
+      <w:r>
+        <w:rPr/>
+        <w:t>Floor Plan</w:t>
+      </w:r>
+      <w:bookmarkEnd w:id="38"/>
+    </w:p>
+    <w:p>
+      <w:pPr>
+        <w:pStyle w:val="Normal"/>
+        <w:spacing w:lineRule="auto" w:line="360"/>
+        <w:rPr/>
+      </w:pPr>
+      <w:r>
+        <w:rPr>
+          <w:b/>
+          <w:color w:val="FF0000"/>
+        </w:rPr>
+        <w:t>Note:</w:t>
+      </w:r>
+      <w:r>
+        <w:rPr>
+          <w:color w:val="FF0000"/>
+        </w:rPr>
+        <w:t xml:space="preserve"> Right-click/ Double-click to open the files as a PDF Object.</w:t>
       </w:r>
     </w:p>
     <w:p>
@@ -7249,7 +6489,7 @@
       <w:r>
         <w:rPr/>
         <w:object>
-          <v:shapetype id="_x0000_tole_rId18" coordsize="21600,21600" o:spt="ole_rId18" o:preferrelative="t" path="m@4@5l@4@11@9@11@9@5xe" filled="f" stroked="f">
+          <v:shapetype id="_x0000_tole_rId17" coordsize="21600,21600" o:spt="ole_rId17" o:preferrelative="t" path="m@4@5l@4@11@9@11@9@5xe" filled="f" stroked="f">
             <v:stroke joinstyle="miter"/>
             <v:formulas>
               <v:f eqn="if lineDrawn pixelLineWidth 0"/>
@@ -7268,107 +6508,27 @@
             <v:path o:extrusionok="f" gradientshapeok="t" o:connecttype="rect"/>
             <o:lock v:ext="edit" aspectratio="t"/>
           </v:shapetype>
-          <v:shape id="ole_rId18" type="_x0000_tole_rId18" style="width:425.45pt;height:654.55pt;mso-wrap-distance-right:0pt" filled="f" o:ole="">
-            <v:imagedata r:id="rId19" o:title=""/>
+          <v:shape id="ole_rId17" type="_x0000_tole_rId17" style="width:477.8pt;height:399.25pt;mso-wrap-distance-right:0pt" filled="f" o:ole="">
+            <v:imagedata r:id="rId18" o:title=""/>
           </v:shape>
-          <o:OLEObject Type="Embed" ProgID="Acrobat.Document.DC" ShapeID="ole_rId18" DrawAspect="Content" ObjectID="_1608916250" r:id="rId18"/>
+          <o:OLEObject Type="Embed" ProgID="Acrobat.Document.DC" ShapeID="ole_rId17" DrawAspect="Content" ObjectID="_142014399" r:id="rId17"/>
         </w:object>
       </w:r>
     </w:p>
     <w:p>
       <w:pPr>
-        <w:pStyle w:val="Normal"/>
-        <w:ind w:left="720" w:hanging="0"/>
-        <w:jc w:val="center"/>
-        <w:rPr/>
-      </w:pPr>
-      <w:r>
-        <w:rPr/>
-      </w:r>
-    </w:p>
-    <w:p>
-      <w:pPr>
-        <w:pStyle w:val="3"/>
-        <w:spacing w:lineRule="auto" w:line="360" w:before="0" w:after="60"/>
-        <w:rPr/>
-      </w:pPr>
-      <w:bookmarkStart w:id="34" w:name="_Toc203748229"/>
-      <w:r>
-        <w:rPr/>
-        <w:t>Floor Plan</w:t>
-      </w:r>
-      <w:bookmarkEnd w:id="34"/>
-    </w:p>
-    <w:p>
-      <w:pPr>
-        <w:pStyle w:val="Normal"/>
-        <w:spacing w:lineRule="auto" w:line="360"/>
-        <w:rPr/>
-      </w:pPr>
-      <w:r>
-        <w:rPr>
-          <w:b/>
-          <w:color w:val="FF0000"/>
-        </w:rPr>
-        <w:t>Note:</w:t>
-      </w:r>
-      <w:r>
-        <w:rPr>
-          <w:color w:val="FF0000"/>
-        </w:rPr>
-        <w:t xml:space="preserve"> Right-click/ Double-click to open the files as a PDF Object.</w:t>
-      </w:r>
-    </w:p>
-    <w:p>
-      <w:pPr>
-        <w:pStyle w:val="Normal"/>
-        <w:spacing w:lineRule="auto" w:line="360"/>
-        <w:jc w:val="center"/>
-        <w:rPr/>
-      </w:pPr>
-      <w:r>
-        <w:rPr/>
-        <w:object>
-          <v:shapetype id="_x0000_tole_rId20" coordsize="21600,21600" o:spt="ole_rId20" o:preferrelative="t" path="m@4@5l@4@11@9@11@9@5xe" filled="f" stroked="f">
-            <v:stroke joinstyle="miter"/>
-            <v:formulas>
-              <v:f eqn="if lineDrawn pixelLineWidth 0"/>
-              <v:f eqn="sum @0 1 0"/>
-              <v:f eqn="sum 0 0 @1"/>
-              <v:f eqn="prod @2 1 2"/>
-              <v:f eqn="prod @3 21600 pixelWidth"/>
-              <v:f eqn="prod @3 21600 pixelHeight"/>
-              <v:f eqn="sum @0 0 1"/>
-              <v:f eqn="prod @6 1 2"/>
-              <v:f eqn="prod @7 21600 pixelWidth"/>
-              <v:f eqn="sum @8 21600 0"/>
-              <v:f eqn="prod @7 21600 pixelHeight"/>
-              <v:f eqn="sum @10 21600 0"/>
-            </v:formulas>
-            <v:path o:extrusionok="f" gradientshapeok="t" o:connecttype="rect"/>
-            <o:lock v:ext="edit" aspectratio="t"/>
-          </v:shapetype>
-          <v:shape id="ole_rId20" type="_x0000_tole_rId20" style="width:477.8pt;height:399.25pt;mso-wrap-distance-right:0pt" filled="f" o:ole="">
-            <v:imagedata r:id="rId21" o:title=""/>
-          </v:shape>
-          <o:OLEObject Type="Embed" ProgID="Acrobat.Document.DC" ShapeID="ole_rId20" DrawAspect="Content" ObjectID="_34220705" r:id="rId20"/>
-        </w:object>
-      </w:r>
-    </w:p>
-    <w:p>
-      <w:pPr>
         <w:pStyle w:val="3"/>
         <w:spacing w:lineRule="auto" w:line="360"/>
         <w:rPr/>
       </w:pPr>
-      <w:bookmarkStart w:id="35" w:name="_Toc171927067"/>
-      <w:bookmarkStart w:id="36" w:name="_Toc203748230"/>
+      <w:bookmarkStart w:id="39" w:name="_Toc203748230"/>
+      <w:bookmarkStart w:id="40" w:name="_Toc171927067"/>
       <w:r>
         <w:rPr/>
         <w:t>Power Requirements</w:t>
       </w:r>
-      <w:bookmarkEnd w:id="35"/>
-      <w:bookmarkEnd w:id="36"/>
+      <w:bookmarkEnd w:id="39"/>
+      <w:bookmarkEnd w:id="40"/>
     </w:p>
     <w:p>
       <w:pPr>
@@ -7387,28 +6547,28 @@
         <w:pStyle w:val="2"/>
         <w:rPr/>
       </w:pPr>
-      <w:bookmarkStart w:id="37" w:name="_Toc171927068"/>
-      <w:bookmarkStart w:id="38" w:name="_Toc203748231"/>
+      <w:bookmarkStart w:id="41" w:name="_Toc203748231"/>
+      <w:bookmarkStart w:id="42" w:name="_Toc171927068"/>
       <w:r>
         <w:rPr/>
         <w:t>activation</w:t>
       </w:r>
-      <w:bookmarkEnd w:id="37"/>
-      <w:bookmarkEnd w:id="38"/>
+      <w:bookmarkEnd w:id="41"/>
+      <w:bookmarkEnd w:id="42"/>
     </w:p>
     <w:p>
       <w:pPr>
         <w:pStyle w:val="3"/>
         <w:rPr/>
       </w:pPr>
-      <w:bookmarkStart w:id="39" w:name="_Toc171927069"/>
-      <w:bookmarkStart w:id="40" w:name="_Toc203748232"/>
+      <w:bookmarkStart w:id="43" w:name="_Toc203748232"/>
+      <w:bookmarkStart w:id="44" w:name="_Toc171927069"/>
       <w:r>
         <w:rPr/>
         <w:t>Power on/Turn up</w:t>
       </w:r>
-      <w:bookmarkEnd w:id="39"/>
-      <w:bookmarkEnd w:id="40"/>
+      <w:bookmarkEnd w:id="43"/>
+      <w:bookmarkEnd w:id="44"/>
     </w:p>
     <w:p>
       <w:pPr>
@@ -7433,14 +6593,14 @@
         <w:spacing w:lineRule="auto" w:line="360"/>
         <w:rPr/>
       </w:pPr>
-      <w:bookmarkStart w:id="41" w:name="_Toc171927070"/>
-      <w:bookmarkStart w:id="42" w:name="_Toc203748233"/>
+      <w:bookmarkStart w:id="45" w:name="_Toc203748233"/>
+      <w:bookmarkStart w:id="46" w:name="_Toc171927070"/>
       <w:r>
         <w:rPr/>
         <w:t>Network Management</w:t>
       </w:r>
-      <w:bookmarkEnd w:id="41"/>
-      <w:bookmarkEnd w:id="42"/>
+      <w:bookmarkEnd w:id="45"/>
+      <w:bookmarkEnd w:id="46"/>
     </w:p>
     <w:p>
       <w:pPr>
@@ -7460,14 +6620,14 @@
         <w:spacing w:lineRule="auto" w:line="360"/>
         <w:rPr/>
       </w:pPr>
-      <w:bookmarkStart w:id="43" w:name="_Toc171927071"/>
-      <w:bookmarkStart w:id="44" w:name="_Toc203748234"/>
+      <w:bookmarkStart w:id="47" w:name="_Toc203748234"/>
+      <w:bookmarkStart w:id="48" w:name="_Toc171927071"/>
       <w:r>
         <w:rPr/>
         <w:t>Test and Acceptance/Commissioning</w:t>
       </w:r>
-      <w:bookmarkEnd w:id="43"/>
-      <w:bookmarkEnd w:id="44"/>
+      <w:bookmarkEnd w:id="47"/>
+      <w:bookmarkEnd w:id="48"/>
     </w:p>
     <w:p>
       <w:pPr>
@@ -7488,12 +6648,12 @@
         <w:jc w:val="both"/>
         <w:rPr/>
       </w:pPr>
-      <w:bookmarkStart w:id="45" w:name="_Toc203748235"/>
+      <w:bookmarkStart w:id="49" w:name="_Toc203748235"/>
       <w:r>
         <w:rPr/>
         <w:t>Supporting Documentation</w:t>
       </w:r>
-      <w:bookmarkEnd w:id="45"/>
+      <w:bookmarkEnd w:id="49"/>
     </w:p>
     <w:p>
       <w:pPr>
@@ -7555,7 +6715,7 @@
         <w:spacing w:lineRule="auto" w:line="360"/>
         <w:rPr/>
       </w:pPr>
-      <w:bookmarkStart w:id="46" w:name="_Toc203748236"/>
+      <w:bookmarkStart w:id="50" w:name="_Toc203748236"/>
       <w:r>
         <w:rPr>
           <w:caps w:val="false"/>
@@ -7563,7 +6723,7 @@
         </w:rPr>
         <w:t>TO BE RETURNED UPON PROJECT COMPLETION</w:t>
       </w:r>
-      <w:bookmarkEnd w:id="46"/>
+      <w:bookmarkEnd w:id="50"/>
     </w:p>
     <w:p>
       <w:pPr>
@@ -7575,24 +6735,24 @@
         <w:spacing w:lineRule="auto" w:line="360"/>
         <w:rPr/>
       </w:pPr>
-      <w:bookmarkStart w:id="47" w:name="_Toc293494360"/>
-      <w:bookmarkStart w:id="48" w:name="_Toc293494423"/>
-      <w:bookmarkStart w:id="49" w:name="_Toc293499182"/>
-      <w:bookmarkStart w:id="50" w:name="_Toc293581785"/>
-      <w:bookmarkStart w:id="51" w:name="_Toc295220445"/>
-      <w:bookmarkStart w:id="52" w:name="_Toc295727309"/>
-      <w:bookmarkStart w:id="53" w:name="_Toc296506347"/>
-      <w:bookmarkStart w:id="54" w:name="_Toc298238844"/>
-      <w:bookmarkStart w:id="55" w:name="_Toc298246997"/>
-      <w:bookmarkEnd w:id="47"/>
-      <w:bookmarkEnd w:id="48"/>
-      <w:bookmarkEnd w:id="49"/>
-      <w:bookmarkEnd w:id="50"/>
+      <w:bookmarkStart w:id="51" w:name="_Toc293494423"/>
+      <w:bookmarkStart w:id="52" w:name="_Toc293494360"/>
+      <w:bookmarkStart w:id="53" w:name="_Toc293499182"/>
+      <w:bookmarkStart w:id="54" w:name="_Toc293581785"/>
+      <w:bookmarkStart w:id="55" w:name="_Toc295727309"/>
+      <w:bookmarkStart w:id="56" w:name="_Toc296506347"/>
+      <w:bookmarkStart w:id="57" w:name="_Toc298238844"/>
+      <w:bookmarkStart w:id="58" w:name="_Toc298246997"/>
+      <w:bookmarkStart w:id="59" w:name="_Toc295220445"/>
       <w:bookmarkEnd w:id="51"/>
       <w:bookmarkEnd w:id="52"/>
       <w:bookmarkEnd w:id="53"/>
       <w:bookmarkEnd w:id="54"/>
       <w:bookmarkEnd w:id="55"/>
+      <w:bookmarkEnd w:id="56"/>
+      <w:bookmarkEnd w:id="57"/>
+      <w:bookmarkEnd w:id="58"/>
+      <w:bookmarkEnd w:id="59"/>
       <w:r>
         <w:rPr/>
         <w:t>As built – All changes must be identified in red ink in cable run list, rack elevation, network drawing as appropriate.</w:t>
@@ -7639,9 +6799,9 @@
         <w:rPr/>
         <w:fldChar w:fldCharType="separate"/>
       </w:r>
-      <w:bookmarkStart w:id="56" w:name="__Fieldmark__13981_678483572"/>
-      <w:bookmarkStart w:id="57" w:name="__Fieldmark__13981_678483572"/>
-      <w:bookmarkEnd w:id="57"/>
+      <w:bookmarkStart w:id="60" w:name="__Fieldmark__837_139913342"/>
+      <w:bookmarkStart w:id="61" w:name="__Fieldmark__837_139913342"/>
+      <w:bookmarkEnd w:id="61"/>
       <w:r>
         <w:rPr/>
       </w:r>
@@ -7649,8 +6809,14 @@
         <w:rPr/>
         <w:fldChar w:fldCharType="end"/>
       </w:r>
-      <w:bookmarkStart w:id="58" w:name="__Fieldmark__981_678483572"/>
-      <w:bookmarkEnd w:id="58"/>
+      <w:bookmarkStart w:id="62" w:name="__Fieldmark__862_2598550597"/>
+      <w:bookmarkStart w:id="63" w:name="__Fieldmark__981_678483572"/>
+      <w:bookmarkStart w:id="64" w:name="__Fieldmark__13981_678483572"/>
+      <w:bookmarkStart w:id="65" w:name="__Fieldmark__28362_2598550597"/>
+      <w:bookmarkEnd w:id="62"/>
+      <w:bookmarkEnd w:id="63"/>
+      <w:bookmarkEnd w:id="64"/>
+      <w:bookmarkEnd w:id="65"/>
       <w:r>
         <w:rPr/>
         <w:t xml:space="preserve"> POWER READING [Before and after]</w:t>
@@ -7683,9 +6849,9 @@
         <w:rPr/>
         <w:fldChar w:fldCharType="separate"/>
       </w:r>
-      <w:bookmarkStart w:id="59" w:name="__Fieldmark__13988_678483572"/>
-      <w:bookmarkStart w:id="60" w:name="__Fieldmark__13988_678483572"/>
-      <w:bookmarkEnd w:id="60"/>
+      <w:bookmarkStart w:id="66" w:name="__Fieldmark__853_139913342"/>
+      <w:bookmarkStart w:id="67" w:name="__Fieldmark__853_139913342"/>
+      <w:bookmarkEnd w:id="67"/>
       <w:r>
         <w:rPr/>
       </w:r>
@@ -7693,8 +6859,14 @@
         <w:rPr/>
         <w:fldChar w:fldCharType="end"/>
       </w:r>
-      <w:bookmarkStart w:id="61" w:name="__Fieldmark__985_678483572"/>
-      <w:bookmarkEnd w:id="61"/>
+      <w:bookmarkStart w:id="68" w:name="__Fieldmark__872_2598550597"/>
+      <w:bookmarkStart w:id="69" w:name="__Fieldmark__28375_2598550597"/>
+      <w:bookmarkStart w:id="70" w:name="__Fieldmark__13988_678483572"/>
+      <w:bookmarkStart w:id="71" w:name="__Fieldmark__985_678483572"/>
+      <w:bookmarkEnd w:id="68"/>
+      <w:bookmarkEnd w:id="69"/>
+      <w:bookmarkEnd w:id="70"/>
+      <w:bookmarkEnd w:id="71"/>
       <w:r>
         <w:rPr/>
         <w:t xml:space="preserve"> RETURN OPTICAL POWER LEVELS</w:t>
@@ -7727,9 +6899,9 @@
         <w:rPr/>
         <w:fldChar w:fldCharType="separate"/>
       </w:r>
-      <w:bookmarkStart w:id="62" w:name="__Fieldmark__13995_678483572"/>
-      <w:bookmarkStart w:id="63" w:name="__Fieldmark__13995_678483572"/>
-      <w:bookmarkEnd w:id="63"/>
+      <w:bookmarkStart w:id="72" w:name="__Fieldmark__869_139913342"/>
+      <w:bookmarkStart w:id="73" w:name="__Fieldmark__869_139913342"/>
+      <w:bookmarkEnd w:id="73"/>
       <w:r>
         <w:rPr/>
       </w:r>
@@ -7737,8 +6909,14 @@
         <w:rPr/>
         <w:fldChar w:fldCharType="end"/>
       </w:r>
-      <w:bookmarkStart w:id="64" w:name="__Fieldmark__988_678483572"/>
-      <w:bookmarkEnd w:id="64"/>
+      <w:bookmarkStart w:id="74" w:name="__Fieldmark__882_2598550597"/>
+      <w:bookmarkStart w:id="75" w:name="__Fieldmark__988_678483572"/>
+      <w:bookmarkStart w:id="76" w:name="__Fieldmark__13995_678483572"/>
+      <w:bookmarkStart w:id="77" w:name="__Fieldmark__28388_2598550597"/>
+      <w:bookmarkEnd w:id="74"/>
+      <w:bookmarkEnd w:id="75"/>
+      <w:bookmarkEnd w:id="76"/>
+      <w:bookmarkEnd w:id="77"/>
       <w:r>
         <w:rPr/>
         <w:t xml:space="preserve"> DEFICIENCY LIST</w:t>
@@ -7772,8 +6950,8 @@
         <w:jc w:val="center"/>
         <w:rPr/>
       </w:pPr>
-      <w:bookmarkStart w:id="65" w:name="_Toc278895679"/>
-      <w:bookmarkStart w:id="66" w:name="_Toc274299552"/>
+      <w:bookmarkStart w:id="78" w:name="_Toc274299552"/>
+      <w:bookmarkStart w:id="79" w:name="_Toc278895679"/>
       <w:r>
         <w:rPr>
           <w:b/>
@@ -7782,12 +6960,12 @@
         </w:rPr>
         <w:t>END OF FILE</w:t>
       </w:r>
-      <w:bookmarkEnd w:id="65"/>
-      <w:bookmarkEnd w:id="66"/>
+      <w:bookmarkEnd w:id="78"/>
+      <w:bookmarkEnd w:id="79"/>
     </w:p>
     <w:sectPr>
-      <w:headerReference w:type="default" r:id="rId22"/>
-      <w:footerReference w:type="default" r:id="rId23"/>
+      <w:headerReference w:type="default" r:id="rId19"/>
+      <w:footerReference w:type="default" r:id="rId20"/>
       <w:type w:val="nextPage"/>
       <w:pgSz w:w="12240" w:h="15840"/>
       <w:pgMar w:left="1080" w:right="758" w:gutter="0" w:header="720" w:top="777" w:footer="720" w:bottom="1276"/>
@@ -7812,7 +6990,7 @@
       <mc:AlternateContent>
         <mc:Choice Requires="wps">
           <w:drawing>
-            <wp:anchor behindDoc="1" distT="0" distB="0" distL="0" distR="0" simplePos="0" locked="0" layoutInCell="0" allowOverlap="1" relativeHeight="2">
+            <wp:anchor behindDoc="0" distT="0" distB="0" distL="0" distR="0" simplePos="0" locked="0" layoutInCell="0" allowOverlap="1" relativeHeight="2">
               <wp:simplePos x="0" y="0"/>
               <wp:positionH relativeFrom="margin">
                 <wp:align>center</wp:align>
@@ -7859,30 +7037,35 @@
                           <w:r>
                             <w:rPr>
                               <w:rStyle w:val="Pagenumber"/>
+                              <w:color w:val="000000"/>
                             </w:rPr>
                             <w:fldChar w:fldCharType="begin"/>
                           </w:r>
                           <w:r>
                             <w:rPr>
                               <w:rStyle w:val="Pagenumber"/>
+                              <w:color w:val="000000"/>
                             </w:rPr>
                             <w:instrText xml:space="preserve"> PAGE </w:instrText>
                           </w:r>
                           <w:r>
                             <w:rPr>
                               <w:rStyle w:val="Pagenumber"/>
+                              <w:color w:val="000000"/>
                             </w:rPr>
                             <w:fldChar w:fldCharType="separate"/>
                           </w:r>
                           <w:r>
                             <w:rPr>
                               <w:rStyle w:val="Pagenumber"/>
+                              <w:color w:val="000000"/>
                             </w:rPr>
                             <w:t>0</w:t>
                           </w:r>
                           <w:r>
                             <w:rPr>
                               <w:rStyle w:val="Pagenumber"/>
+                              <w:color w:val="000000"/>
                             </w:rPr>
                             <w:fldChar w:fldCharType="end"/>
                           </w:r>
@@ -7900,8 +7083,8 @@
         </mc:Choice>
         <mc:Fallback>
           <w:pict>
-            <v:rect id="shape_0" ID="Врезка2" path="m0,0l-2147483645,0l-2147483645,-2147483646l0,-2147483646xe" fillcolor="white" stroked="f" o:allowincell="f" style="position:absolute;margin-left:0pt;margin-top:0.05pt;width:1.1pt;height:1.1pt;mso-wrap-style:square;v-text-anchor:top;mso-position-horizontal:center;mso-position-horizontal-relative:margin">
-              <v:fill o:detectmouseclick="t" type="solid" color2="black" opacity="0"/>
+            <v:rect id="shape_0" ID="Врезка2" path="m0,0l-2147483645,0l-2147483645,-2147483646l0,-2147483646xe" stroked="f" o:allowincell="f" style="position:absolute;margin-left:0pt;margin-top:0.05pt;width:1.1pt;height:1.1pt;mso-wrap-style:square;v-text-anchor:top;mso-position-horizontal:center;mso-position-horizontal-relative:margin">
+              <v:fill o:detectmouseclick="t" on="false"/>
               <v:stroke color="#3465a4" joinstyle="round" endcap="flat"/>
               <v:textbox>
                 <w:txbxContent>
@@ -7915,30 +7098,35 @@
                     <w:r>
                       <w:rPr>
                         <w:rStyle w:val="Pagenumber"/>
+                        <w:color w:val="000000"/>
                       </w:rPr>
                       <w:fldChar w:fldCharType="begin"/>
                     </w:r>
                     <w:r>
                       <w:rPr>
                         <w:rStyle w:val="Pagenumber"/>
+                        <w:color w:val="000000"/>
                       </w:rPr>
                       <w:instrText xml:space="preserve"> PAGE </w:instrText>
                     </w:r>
                     <w:r>
                       <w:rPr>
                         <w:rStyle w:val="Pagenumber"/>
+                        <w:color w:val="000000"/>
                       </w:rPr>
                       <w:fldChar w:fldCharType="separate"/>
                     </w:r>
                     <w:r>
                       <w:rPr>
                         <w:rStyle w:val="Pagenumber"/>
+                        <w:color w:val="000000"/>
                       </w:rPr>
                       <w:t>0</w:t>
                     </w:r>
                     <w:r>
                       <w:rPr>
                         <w:rStyle w:val="Pagenumber"/>
+                        <w:color w:val="000000"/>
                       </w:rPr>
                       <w:fldChar w:fldCharType="end"/>
                     </w:r>
@@ -8155,7 +7343,7 @@
       <w:rPr>
         <w:rStyle w:val="Pagenumber"/>
       </w:rPr>
-      <w:t>6</w:t>
+      <w:t>5</w:t>
     </w:r>
     <w:r>
       <w:rPr>
@@ -8283,7 +7471,7 @@
       <w:rPr>
         <w:rStyle w:val="Pagenumber"/>
       </w:rPr>
-      <w:t>10</w:t>
+      <w:t>9</w:t>
     </w:r>
     <w:r>
       <w:rPr>
@@ -8380,7 +7568,7 @@
       <mc:AlternateContent>
         <mc:Choice Requires="wps">
           <w:drawing>
-            <wp:anchor behindDoc="1" distT="0" distB="0" distL="0" distR="0" simplePos="0" locked="0" layoutInCell="0" allowOverlap="1" relativeHeight="3">
+            <wp:anchor behindDoc="0" distT="0" distB="0" distL="0" distR="0" simplePos="0" locked="0" layoutInCell="0" allowOverlap="1" relativeHeight="3">
               <wp:simplePos x="0" y="0"/>
               <wp:positionH relativeFrom="margin">
                 <wp:align>right</wp:align>
@@ -8427,30 +7615,35 @@
                           <w:r>
                             <w:rPr>
                               <w:rStyle w:val="Pagenumber"/>
+                              <w:color w:val="000000"/>
                             </w:rPr>
                             <w:fldChar w:fldCharType="begin"/>
                           </w:r>
                           <w:r>
                             <w:rPr>
                               <w:rStyle w:val="Pagenumber"/>
+                              <w:color w:val="000000"/>
                             </w:rPr>
                             <w:instrText xml:space="preserve"> PAGE </w:instrText>
                           </w:r>
                           <w:r>
                             <w:rPr>
                               <w:rStyle w:val="Pagenumber"/>
+                              <w:color w:val="000000"/>
                             </w:rPr>
                             <w:fldChar w:fldCharType="separate"/>
                           </w:r>
                           <w:r>
                             <w:rPr>
                               <w:rStyle w:val="Pagenumber"/>
+                              <w:color w:val="000000"/>
                             </w:rPr>
                             <w:t>0</w:t>
                           </w:r>
                           <w:r>
                             <w:rPr>
                               <w:rStyle w:val="Pagenumber"/>
+                              <w:color w:val="000000"/>
                             </w:rPr>
                             <w:fldChar w:fldCharType="end"/>
                           </w:r>
@@ -8468,8 +7661,8 @@
         </mc:Choice>
         <mc:Fallback>
           <w:pict>
-            <v:rect id="shape_0" ID="Врезка1" path="m0,0l-2147483645,0l-2147483645,-2147483646l0,-2147483646xe" fillcolor="white" stroked="f" o:allowincell="f" style="position:absolute;margin-left:0pt;margin-top:0.05pt;width:1.1pt;height:1.1pt;mso-wrap-style:square;v-text-anchor:top;mso-position-horizontal:right;mso-position-horizontal-relative:margin">
-              <v:fill o:detectmouseclick="t" type="solid" color2="black" opacity="0"/>
+            <v:rect id="shape_0" ID="Врезка1" path="m0,0l-2147483645,0l-2147483645,-2147483646l0,-2147483646xe" stroked="f" o:allowincell="f" style="position:absolute;margin-left:0pt;margin-top:0.05pt;width:1.1pt;height:1.1pt;mso-wrap-style:square;v-text-anchor:top;mso-position-horizontal:right;mso-position-horizontal-relative:margin">
+              <v:fill o:detectmouseclick="t" on="false"/>
               <v:stroke color="#3465a4" joinstyle="round" endcap="flat"/>
               <v:textbox>
                 <w:txbxContent>
@@ -8483,30 +7676,35 @@
                     <w:r>
                       <w:rPr>
                         <w:rStyle w:val="Pagenumber"/>
+                        <w:color w:val="000000"/>
                       </w:rPr>
                       <w:fldChar w:fldCharType="begin"/>
                     </w:r>
                     <w:r>
                       <w:rPr>
                         <w:rStyle w:val="Pagenumber"/>
+                        <w:color w:val="000000"/>
                       </w:rPr>
                       <w:instrText xml:space="preserve"> PAGE </w:instrText>
                     </w:r>
                     <w:r>
                       <w:rPr>
                         <w:rStyle w:val="Pagenumber"/>
+                        <w:color w:val="000000"/>
                       </w:rPr>
                       <w:fldChar w:fldCharType="separate"/>
                     </w:r>
                     <w:r>
                       <w:rPr>
                         <w:rStyle w:val="Pagenumber"/>
+                        <w:color w:val="000000"/>
                       </w:rPr>
                       <w:t>0</w:t>
                     </w:r>
                     <w:r>
                       <w:rPr>
                         <w:rStyle w:val="Pagenumber"/>
+                        <w:color w:val="000000"/>
                       </w:rPr>
                       <w:fldChar w:fldCharType="end"/>
                     </w:r>

</xml_diff>